<commit_message>
Correccion 03 - termine hasta caggiano
</commit_message>
<xml_diff>
--- a/Practicos/Notas y Devoluciones 03.docx
+++ b/Practicos/Notas y Devoluciones 03.docx
@@ -1196,19 +1196,22 @@
         <w:t>🎉</w:t>
       </w:r>
       <w:r>
-        <w:t xml:space="preserve">¡Felicitaciones por la entrega del Desafío 02! </w:t>
-      </w:r>
-      <w:r>
-        <w:rPr>
-          <w:rFonts w:ascii="Segoe UI Emoji" w:hAnsi="Segoe UI Emoji" w:cs="Segoe UI Emoji"/>
-        </w:rPr>
-        <w:t>🎉</w:t>
-      </w:r>
-    </w:p>
-    <w:p/>
-    <w:p>
-      <w:r>
-        <w:t>Hipolito, excelente trabajo, el resultado es el que se solicitó en enunciado.</w:t>
+        <w:t xml:space="preserve">¡Felicitaciones por la entrega del Desafío 03! </w:t>
+      </w:r>
+      <w:r>
+        <w:rPr>
+          <w:rFonts w:ascii="Segoe UI Emoji" w:hAnsi="Segoe UI Emoji" w:cs="Segoe UI Emoji"/>
+        </w:rPr>
+        <w:t>🎉</w:t>
+      </w:r>
+    </w:p>
+    <w:p/>
+    <w:p>
+      <w:r>
+        <w:t>Hipolito</w:t>
+      </w:r>
+      <w:r>
+        <w:t>, el trabajo realizado es excelente. Destaco la prolijidad del documento ¡</w:t>
       </w:r>
     </w:p>
     <w:p/>
@@ -1220,32 +1223,26 @@
     <w:p/>
     <w:p>
       <w:r>
-        <w:t>La manipulación de enlaces relativos o absolutos quedo perfecto. Genial que aplicaste pseudoclases para los enlaces.</w:t>
-      </w:r>
-    </w:p>
-    <w:p/>
-    <w:p>
-      <w:r>
-        <w:t xml:space="preserve">La vinculación de la página de estilos externa es correcta, </w:t>
-      </w:r>
-      <w:r>
-        <w:t>buenísimo</w:t>
-      </w:r>
-      <w:r>
-        <w:t xml:space="preserve"> que usaste clases e id’s, quedo genial.</w:t>
-      </w:r>
-    </w:p>
-    <w:p/>
-    <w:p>
-      <w:r>
-        <w:t xml:space="preserve">Destaco que completaste los atributos alt de las imágenes, esto ayuda a mejorar la accesibilidad de sito web. </w:t>
-      </w:r>
-    </w:p>
-    <w:p/>
-    <w:p/>
-    <w:p>
-      <w:r>
-        <w:t xml:space="preserve">Tu nota en el Desafío 02 es: </w:t>
+        <w:t>La barra de navegación principal quedo ok, los links configurados con estado hover como se solicitó.</w:t>
+      </w:r>
+    </w:p>
+    <w:p/>
+    <w:p>
+      <w:r>
+        <w:t xml:space="preserve">La implementación de Formularios es correcta, los campos con sus tipos de datos respectivos. </w:t>
+      </w:r>
+    </w:p>
+    <w:p/>
+    <w:p>
+      <w:r>
+        <w:t>Los estilos solicitados tanto en colores, fuentes y dimensiones quedaron ok, también aplicaste correctamente las propiedades de box model. EL layout quedó responsivo como se solicitó en enunciado.</w:t>
+      </w:r>
+    </w:p>
+    <w:p/>
+    <w:p/>
+    <w:p>
+      <w:r>
+        <w:t xml:space="preserve">Tu nota en el Desafío 03 es: </w:t>
       </w:r>
       <w:r>
         <w:rPr>
@@ -1423,19 +1420,22 @@
         <w:t>🎉</w:t>
       </w:r>
       <w:r>
-        <w:t xml:space="preserve">¡Felicitaciones por la entrega del Desafío 02! </w:t>
-      </w:r>
-      <w:r>
-        <w:rPr>
-          <w:rFonts w:ascii="Segoe UI Emoji" w:hAnsi="Segoe UI Emoji" w:cs="Segoe UI Emoji"/>
-        </w:rPr>
-        <w:t>🎉</w:t>
-      </w:r>
-    </w:p>
-    <w:p/>
-    <w:p>
-      <w:r>
-        <w:t>Ariana, excelente trabajo, el resultado es el que se solicitó en enunciado.</w:t>
+        <w:t xml:space="preserve">¡Felicitaciones por la entrega del Desafío 03! </w:t>
+      </w:r>
+      <w:r>
+        <w:rPr>
+          <w:rFonts w:ascii="Segoe UI Emoji" w:hAnsi="Segoe UI Emoji" w:cs="Segoe UI Emoji"/>
+        </w:rPr>
+        <w:t>🎉</w:t>
+      </w:r>
+    </w:p>
+    <w:p/>
+    <w:p>
+      <w:r>
+        <w:t>Ariana</w:t>
+      </w:r>
+      <w:r>
+        <w:t>, el trabajo realizado es excelente. Destaco la prolijidad del documento ¡</w:t>
       </w:r>
     </w:p>
     <w:p/>
@@ -1444,61 +1444,42 @@
         <w:t>La estructura HTML esta impecable, destaco la correcta implementación de contenedores semánticos como main, section, footer, etc. El manejo de listas, textos y títulos es correcto.</w:t>
       </w:r>
     </w:p>
-    <w:p>
-      <w:r>
-        <w:t>Genial que trabajaste con fuentes de Google, quedo muy bien.</w:t>
-      </w:r>
-    </w:p>
-    <w:p/>
-    <w:p>
-      <w:r>
-        <w:t>La manipulación de enlaces relativos o absolutos quedo perfecto. Genial que aplicaste pseudoclases para los enlaces.</w:t>
-      </w:r>
-    </w:p>
-    <w:p/>
-    <w:p>
-      <w:r>
-        <w:t>La vinculación de la página de estilos externa es correcta, buenísimo que usaste clases e id’s, quedo genial.</w:t>
-      </w:r>
-    </w:p>
-    <w:p/>
-    <w:p>
-      <w:r>
-        <w:t>Destaco que completaste los atributos alt de las imágenes, esto ayuda a mejorar la accesibilidad de</w:t>
-      </w:r>
-      <w:r>
-        <w:t>l</w:t>
-      </w:r>
-      <w:r>
-        <w:t xml:space="preserve"> sit</w:t>
-      </w:r>
-      <w:r>
-        <w:t>i</w:t>
-      </w:r>
-      <w:r>
-        <w:t xml:space="preserve">o web. </w:t>
-      </w:r>
-      <w:r>
-        <w:t>El juego de sombras que aplicaste a las imágenes tambien quedo muy bien.</w:t>
-      </w:r>
-    </w:p>
-    <w:p>
-      <w:r>
-        <w:t>No esta mal que hayas usado estilos en línea en las imágenes pero es buena practica aplicar esas propiedades en la hoja de estilos externa con selectores de clases o id’s.</w:t>
-      </w:r>
-    </w:p>
-    <w:p/>
-    <w:p/>
-    <w:p>
-      <w:r>
-        <w:t xml:space="preserve">Tu nota en el Desafío 02 es: </w:t>
-      </w:r>
-      <w:r>
-        <w:rPr>
-          <w:b/>
-          <w:bCs/>
-        </w:rPr>
-        <w:t>10</w:t>
+    <w:p/>
+    <w:p>
+      <w:r>
+        <w:t>La barra de navegación principal quedo ok, los links configurados con estado hover como se solicitó.</w:t>
+      </w:r>
+    </w:p>
+    <w:p/>
+    <w:p>
+      <w:r>
+        <w:t>Las imágenes están bien creadas, destaco que completaste el atributo alt de las mismas, una mejora para que no se deformen al redimensionar la pantalla es aplicar por css la propiedad “object-fit: cover” con esto te aseguras que sin importar que las proporciones de la imagen y el contenedor coincidan de ultima que la imagen se recorte pero que no llegue a deformarse.</w:t>
+      </w:r>
+    </w:p>
+    <w:p/>
+    <w:p>
+      <w:r>
+        <w:t xml:space="preserve">La implementación de Formularios es correcta, los campos con sus tipos de datos respectivos. </w:t>
+      </w:r>
+    </w:p>
+    <w:p/>
+    <w:p>
+      <w:r>
+        <w:t>Los estilos solicitados tanto en colores, fuentes y dimensiones quedaron ok, también aplicaste correctamente las propiedades de box model. EL layout quedó responsivo como se solicitó en enunciado.</w:t>
+      </w:r>
+    </w:p>
+    <w:p/>
+    <w:p/>
+    <w:p>
+      <w:r>
+        <w:t xml:space="preserve">Tu nota en el Desafío 03 es: </w:t>
+      </w:r>
+      <w:r>
+        <w:rPr>
+          <w:b/>
+          <w:bCs/>
+        </w:rPr>
+        <w:t>9</w:t>
       </w:r>
     </w:p>
     <w:p/>
@@ -2035,10 +2016,7 @@
     <w:p/>
     <w:p>
       <w:r>
-        <w:t>Catalina</w:t>
-      </w:r>
-      <w:r>
-        <w:t>, el trabajo realizado es excelente. Destaco la prolijidad del documento ¡</w:t>
+        <w:t>Catalina, el trabajo realizado es excelente. Destaco la prolijidad del documento ¡</w:t>
       </w:r>
     </w:p>
     <w:p/>
@@ -2128,19 +2106,22 @@
         <w:t>🎉</w:t>
       </w:r>
       <w:r>
-        <w:t xml:space="preserve">¡Felicitaciones por la entrega del Desafío 02! </w:t>
-      </w:r>
-      <w:r>
-        <w:rPr>
-          <w:rFonts w:ascii="Segoe UI Emoji" w:hAnsi="Segoe UI Emoji" w:cs="Segoe UI Emoji"/>
-        </w:rPr>
-        <w:t>🎉</w:t>
-      </w:r>
-    </w:p>
-    <w:p/>
-    <w:p>
-      <w:r>
-        <w:t>Micaela, excelente trabajo, el resultado es el que se solicitó en enunciado.</w:t>
+        <w:t xml:space="preserve">¡Felicitaciones por la entrega del Desafío 03! </w:t>
+      </w:r>
+      <w:r>
+        <w:rPr>
+          <w:rFonts w:ascii="Segoe UI Emoji" w:hAnsi="Segoe UI Emoji" w:cs="Segoe UI Emoji"/>
+        </w:rPr>
+        <w:t>🎉</w:t>
+      </w:r>
+    </w:p>
+    <w:p/>
+    <w:p>
+      <w:r>
+        <w:t>Micaela</w:t>
+      </w:r>
+      <w:r>
+        <w:t>, el trabajo realizado es excelente. Destaco la prolijidad del documento ¡</w:t>
       </w:r>
     </w:p>
     <w:p/>
@@ -2152,26 +2133,26 @@
     <w:p/>
     <w:p>
       <w:r>
-        <w:t>La manipulación de enlaces relativos o absolutos quedo perfecto. Genial que aplicaste pseudoclases para los enlaces.</w:t>
-      </w:r>
-    </w:p>
-    <w:p/>
-    <w:p>
-      <w:r>
-        <w:t>La vinculación de la página de estilos externa es correcta, buenisimo que usaste clases e id’s, quedo genial.</w:t>
-      </w:r>
-    </w:p>
-    <w:p/>
-    <w:p>
-      <w:r>
-        <w:t>Destaco que completaste los atributos alt de las imágenes, esto ayuda a mejorar la accesibilidad de sito web.</w:t>
-      </w:r>
-    </w:p>
-    <w:p/>
-    <w:p/>
-    <w:p>
-      <w:r>
-        <w:t xml:space="preserve">Tu nota en el Desafío 02 es: </w:t>
+        <w:t>La barra de navegación principal quedo ok, los links configurados con estado hover como se solicitó.</w:t>
+      </w:r>
+    </w:p>
+    <w:p/>
+    <w:p>
+      <w:r>
+        <w:t xml:space="preserve">La implementación de Formularios es correcta, los campos con sus tipos de datos respectivos. </w:t>
+      </w:r>
+    </w:p>
+    <w:p/>
+    <w:p>
+      <w:r>
+        <w:t>Los estilos solicitados tanto en colores, fuentes y dimensiones quedaron ok, también aplicaste correctamente las propiedades de box model. EL layout quedó responsivo como se solicitó en enunciado.</w:t>
+      </w:r>
+    </w:p>
+    <w:p/>
+    <w:p/>
+    <w:p>
+      <w:r>
+        <w:t xml:space="preserve">Tu nota en el Desafío 03 es: </w:t>
       </w:r>
       <w:r>
         <w:rPr>

</xml_diff>

<commit_message>
Correccion 03 hasta Gonzalez Diego y corregi devolucion Dean Tomas
</commit_message>
<xml_diff>
--- a/Practicos/Notas y Devoluciones 03.docx
+++ b/Practicos/Notas y Devoluciones 03.docx
@@ -1,6 +1,6 @@
 
 <file path=word/document.xml><?xml version="1.0" encoding="utf-8"?>
-<w:document xmlns:wpc="http://schemas.microsoft.com/office/word/2010/wordprocessingCanvas" xmlns:cx="http://schemas.microsoft.com/office/drawing/2014/chartex" xmlns:cx1="http://schemas.microsoft.com/office/drawing/2015/9/8/chartex" xmlns:cx2="http://schemas.microsoft.com/office/drawing/2015/10/21/chartex" xmlns:cx3="http://schemas.microsoft.com/office/drawing/2016/5/9/chartex" xmlns:cx4="http://schemas.microsoft.com/office/drawing/2016/5/10/chartex" xmlns:cx5="http://schemas.microsoft.com/office/drawing/2016/5/11/chartex" xmlns:cx6="http://schemas.microsoft.com/office/drawing/2016/5/12/chartex" xmlns:cx7="http://schemas.microsoft.com/office/drawing/2016/5/13/chartex" xmlns:cx8="http://schemas.microsoft.com/office/drawing/2016/5/14/chartex" xmlns:mc="http://schemas.openxmlformats.org/markup-compatibility/2006" xmlns:aink="http://schemas.microsoft.com/office/drawing/2016/ink" xmlns:am3d="http://schemas.microsoft.com/office/drawing/2017/model3d" xmlns:o="urn:schemas-microsoft-com:office:office" xmlns:oel="http://schemas.microsoft.com/office/2019/extlst" xmlns:r="http://schemas.openxmlformats.org/officeDocument/2006/relationships" xmlns:m="http://schemas.openxmlformats.org/officeDocument/2006/math" xmlns:v="urn:schemas-microsoft-com:vml" xmlns:wp14="http://schemas.microsoft.com/office/word/2010/wordprocessingDrawing" xmlns:wp="http://schemas.openxmlformats.org/drawingml/2006/wordprocessingDrawing" xmlns:w10="urn:schemas-microsoft-com:office:word" xmlns:w="http://schemas.openxmlformats.org/wordprocessingml/2006/main" xmlns:w14="http://schemas.microsoft.com/office/word/2010/wordml" xmlns:w15="http://schemas.microsoft.com/office/word/2012/wordml" xmlns:w16cex="http://schemas.microsoft.com/office/word/2018/wordml/cex" xmlns:w16cid="http://schemas.microsoft.com/office/word/2016/wordml/cid" xmlns:w16="http://schemas.microsoft.com/office/word/2018/wordml" xmlns:w16du="http://schemas.microsoft.com/office/word/2023/wordml/word16du" xmlns:w16sdtdh="http://schemas.microsoft.com/office/word/2020/wordml/sdtdatahash" xmlns:w16sdtfl="http://schemas.microsoft.com/office/word/2024/wordml/sdtformatlock" xmlns:w16se="http://schemas.microsoft.com/office/word/2015/wordml/symex" xmlns:wpg="http://schemas.microsoft.com/office/word/2010/wordprocessingGroup" xmlns:wpi="http://schemas.microsoft.com/office/word/2010/wordprocessingInk" xmlns:wne="http://schemas.microsoft.com/office/word/2006/wordml" xmlns:wps="http://schemas.microsoft.com/office/word/2010/wordprocessingShape" mc:Ignorable="w14 w15 w16se w16cid w16 w16cex w16sdtdh w16sdtfl w16du wp14">
+<w:document xmlns:wpc="http://schemas.microsoft.com/office/word/2010/wordprocessingCanvas" xmlns:cx="http://schemas.microsoft.com/office/drawing/2014/chartex" xmlns:cx1="http://schemas.microsoft.com/office/drawing/2015/9/8/chartex" xmlns:cx2="http://schemas.microsoft.com/office/drawing/2015/10/21/chartex" xmlns:cx3="http://schemas.microsoft.com/office/drawing/2016/5/9/chartex" xmlns:cx4="http://schemas.microsoft.com/office/drawing/2016/5/10/chartex" xmlns:cx5="http://schemas.microsoft.com/office/drawing/2016/5/11/chartex" xmlns:cx6="http://schemas.microsoft.com/office/drawing/2016/5/12/chartex" xmlns:cx7="http://schemas.microsoft.com/office/drawing/2016/5/13/chartex" xmlns:cx8="http://schemas.microsoft.com/office/drawing/2016/5/14/chartex" xmlns:mc="http://schemas.openxmlformats.org/markup-compatibility/2006" xmlns:aink="http://schemas.microsoft.com/office/drawing/2016/ink" xmlns:am3d="http://schemas.microsoft.com/office/drawing/2017/model3d" xmlns:o="urn:schemas-microsoft-com:office:office" xmlns:oel="http://schemas.microsoft.com/office/2019/extlst" xmlns:r="http://schemas.openxmlformats.org/officeDocument/2006/relationships" xmlns:m="http://schemas.openxmlformats.org/officeDocument/2006/math" xmlns:v="urn:schemas-microsoft-com:vml" xmlns:wp14="http://schemas.microsoft.com/office/word/2010/wordprocessingDrawing" xmlns:wp="http://schemas.openxmlformats.org/drawingml/2006/wordprocessingDrawing" xmlns:w10="urn:schemas-microsoft-com:office:word" xmlns:w="http://schemas.openxmlformats.org/wordprocessingml/2006/main" xmlns:w14="http://schemas.microsoft.com/office/word/2010/wordml" xmlns:w15="http://schemas.microsoft.com/office/word/2012/wordml" xmlns:w16cex="http://schemas.microsoft.com/office/word/2018/wordml/cex" xmlns:w16cid="http://schemas.microsoft.com/office/word/2016/wordml/cid" xmlns:w16="http://schemas.microsoft.com/office/word/2018/wordml" xmlns:w16sdtdh="http://schemas.microsoft.com/office/word/2020/wordml/sdtdatahash" xmlns:w16se="http://schemas.microsoft.com/office/word/2015/wordml/symex" xmlns:wpg="http://schemas.microsoft.com/office/word/2010/wordprocessingGroup" xmlns:wpi="http://schemas.microsoft.com/office/word/2010/wordprocessingInk" xmlns:wne="http://schemas.microsoft.com/office/word/2006/wordml" xmlns:wps="http://schemas.microsoft.com/office/word/2010/wordprocessingShape" mc:Ignorable="w14 w15 w16se w16cid w16 w16cex w16sdtdh wp14">
   <w:body>
     <w:p>
       <w:pPr>
@@ -35,6 +35,7 @@
           <w:rFonts w:ascii="Segoe UI Emoji" w:hAnsi="Segoe UI Emoji" w:cs="Segoe UI Emoji"/>
         </w:rPr>
       </w:pPr>
+      <w:proofErr w:type="gramStart"/>
       <w:r>
         <w:rPr>
           <w:rFonts w:ascii="Segoe UI Emoji" w:hAnsi="Segoe UI Emoji" w:cs="Segoe UI Emoji"/>
@@ -42,7 +43,11 @@
         <w:t>🎉</w:t>
       </w:r>
       <w:r>
-        <w:t>¡Felicitaciones por la entrega del Desafío 0</w:t>
+        <w:t>¡</w:t>
+      </w:r>
+      <w:proofErr w:type="gramEnd"/>
+      <w:r>
+        <w:t>Felicitaciones por la entrega del Desafío 0</w:t>
       </w:r>
       <w:r>
         <w:t>3</w:t>
@@ -69,7 +74,31 @@
     <w:p/>
     <w:p>
       <w:r>
-        <w:t>La estructura HTML esta impecable, destaco la correcta implementación de contenedores semánticos como main, section, footer, etc. E</w:t>
+        <w:t xml:space="preserve">La estructura HTML esta impecable, destaco la correcta implementación de contenedores semánticos como </w:t>
+      </w:r>
+      <w:proofErr w:type="spellStart"/>
+      <w:r>
+        <w:t>main</w:t>
+      </w:r>
+      <w:proofErr w:type="spellEnd"/>
+      <w:r>
+        <w:t xml:space="preserve">, </w:t>
+      </w:r>
+      <w:proofErr w:type="spellStart"/>
+      <w:r>
+        <w:t>section</w:t>
+      </w:r>
+      <w:proofErr w:type="spellEnd"/>
+      <w:r>
+        <w:t xml:space="preserve">, </w:t>
+      </w:r>
+      <w:proofErr w:type="spellStart"/>
+      <w:r>
+        <w:t>footer</w:t>
+      </w:r>
+      <w:proofErr w:type="spellEnd"/>
+      <w:r>
+        <w:t>, etc. E</w:t>
       </w:r>
       <w:r>
         <w:t>l</w:t>
@@ -87,7 +116,15 @@
         <w:t>links configurados</w:t>
       </w:r>
       <w:r>
-        <w:t xml:space="preserve"> con estado hover como se </w:t>
+        <w:t xml:space="preserve"> con estado </w:t>
+      </w:r>
+      <w:proofErr w:type="spellStart"/>
+      <w:r>
+        <w:t>hover</w:t>
+      </w:r>
+      <w:proofErr w:type="spellEnd"/>
+      <w:r>
+        <w:t xml:space="preserve"> como se </w:t>
       </w:r>
       <w:r>
         <w:t>solicitó</w:t>
@@ -105,13 +142,45 @@
         <w:t>Acá</w:t>
       </w:r>
       <w:r>
-        <w:t xml:space="preserve"> en el textarea para no setearle un height </w:t>
+        <w:t xml:space="preserve"> en el </w:t>
+      </w:r>
+      <w:proofErr w:type="spellStart"/>
+      <w:r>
+        <w:t>textarea</w:t>
+      </w:r>
+      <w:proofErr w:type="spellEnd"/>
+      <w:r>
+        <w:t xml:space="preserve"> para no </w:t>
+      </w:r>
+      <w:proofErr w:type="spellStart"/>
+      <w:r>
+        <w:t>setearle</w:t>
+      </w:r>
+      <w:proofErr w:type="spellEnd"/>
+      <w:r>
+        <w:t xml:space="preserve"> un </w:t>
+      </w:r>
+      <w:proofErr w:type="spellStart"/>
+      <w:r>
+        <w:t>height</w:t>
+      </w:r>
+      <w:proofErr w:type="spellEnd"/>
+      <w:r>
+        <w:t xml:space="preserve"> </w:t>
       </w:r>
       <w:r>
         <w:t>podías</w:t>
       </w:r>
       <w:r>
-        <w:t xml:space="preserve"> aplicar el atributo rows </w:t>
+        <w:t xml:space="preserve"> aplicar el atributo </w:t>
+      </w:r>
+      <w:proofErr w:type="spellStart"/>
+      <w:r>
+        <w:t>rows</w:t>
+      </w:r>
+      <w:proofErr w:type="spellEnd"/>
+      <w:r>
+        <w:t xml:space="preserve"> </w:t>
       </w:r>
       <w:r>
         <w:t>directo</w:t>
@@ -123,7 +192,23 @@
     <w:p/>
     <w:p>
       <w:r>
-        <w:t>Los estilos solicitados tanto en colores, fuentes y dimensiones quedaron ok, también aplicaste correctamente las propiedades de box model. EL layout quedó responsivo como se solicitó en enunciado.</w:t>
+        <w:t xml:space="preserve">Los estilos solicitados tanto en colores, fuentes y dimensiones quedaron ok, también aplicaste correctamente las propiedades de box </w:t>
+      </w:r>
+      <w:proofErr w:type="spellStart"/>
+      <w:r>
+        <w:t>model</w:t>
+      </w:r>
+      <w:proofErr w:type="spellEnd"/>
+      <w:r>
+        <w:t xml:space="preserve">. EL </w:t>
+      </w:r>
+      <w:proofErr w:type="spellStart"/>
+      <w:r>
+        <w:t>layout</w:t>
+      </w:r>
+      <w:proofErr w:type="spellEnd"/>
+      <w:r>
+        <w:t xml:space="preserve"> quedó responsivo como se solicitó en enunciado.</w:t>
       </w:r>
     </w:p>
     <w:p/>
@@ -169,6 +254,7 @@
           <w:bCs/>
         </w:rPr>
       </w:pPr>
+      <w:proofErr w:type="spellStart"/>
       <w:r>
         <w:rPr>
           <w:rFonts w:ascii="Segoe UI Emoji" w:hAnsi="Segoe UI Emoji" w:cs="Segoe UI Emoji"/>
@@ -191,24 +277,44 @@
           <w:b/>
           <w:bCs/>
         </w:rPr>
-        <w:t>lez Diego Gaston</w:t>
-      </w:r>
-    </w:p>
-    <w:p>
-      <w:pPr>
-        <w:rPr>
-          <w:rFonts w:ascii="Segoe UI Emoji" w:hAnsi="Segoe UI Emoji" w:cs="Segoe UI Emoji"/>
-          <w:b/>
-          <w:bCs/>
-        </w:rPr>
-      </w:pPr>
-    </w:p>
-    <w:p>
-      <w:pPr>
-        <w:rPr>
-          <w:rFonts w:ascii="Segoe UI Emoji" w:hAnsi="Segoe UI Emoji" w:cs="Segoe UI Emoji"/>
-        </w:rPr>
-      </w:pPr>
+        <w:t>lez</w:t>
+      </w:r>
+      <w:proofErr w:type="spellEnd"/>
+      <w:r>
+        <w:rPr>
+          <w:rFonts w:ascii="Segoe UI Emoji" w:hAnsi="Segoe UI Emoji" w:cs="Segoe UI Emoji"/>
+          <w:b/>
+          <w:bCs/>
+        </w:rPr>
+        <w:t xml:space="preserve"> Diego </w:t>
+      </w:r>
+      <w:proofErr w:type="spellStart"/>
+      <w:r>
+        <w:rPr>
+          <w:rFonts w:ascii="Segoe UI Emoji" w:hAnsi="Segoe UI Emoji" w:cs="Segoe UI Emoji"/>
+          <w:b/>
+          <w:bCs/>
+        </w:rPr>
+        <w:t>Gaston</w:t>
+      </w:r>
+      <w:proofErr w:type="spellEnd"/>
+    </w:p>
+    <w:p>
+      <w:pPr>
+        <w:rPr>
+          <w:rFonts w:ascii="Segoe UI Emoji" w:hAnsi="Segoe UI Emoji" w:cs="Segoe UI Emoji"/>
+          <w:b/>
+          <w:bCs/>
+        </w:rPr>
+      </w:pPr>
+    </w:p>
+    <w:p>
+      <w:pPr>
+        <w:rPr>
+          <w:rFonts w:ascii="Segoe UI Emoji" w:hAnsi="Segoe UI Emoji" w:cs="Segoe UI Emoji"/>
+        </w:rPr>
+      </w:pPr>
+      <w:proofErr w:type="gramStart"/>
       <w:r>
         <w:rPr>
           <w:rFonts w:ascii="Segoe UI Emoji" w:hAnsi="Segoe UI Emoji" w:cs="Segoe UI Emoji"/>
@@ -216,7 +322,11 @@
         <w:t>🎉</w:t>
       </w:r>
       <w:r>
-        <w:t xml:space="preserve">¡Felicitaciones por la entrega del Desafío 02! </w:t>
+        <w:t>¡</w:t>
+      </w:r>
+      <w:proofErr w:type="gramEnd"/>
+      <w:r>
+        <w:t xml:space="preserve">Felicitaciones por la entrega del Desafío 03! </w:t>
       </w:r>
       <w:r>
         <w:rPr>
@@ -228,41 +338,117 @@
     <w:p/>
     <w:p>
       <w:r>
-        <w:t>Diego, excelente trabajo, el resultado es el que se solicitó en enunciado.</w:t>
-      </w:r>
-    </w:p>
-    <w:p/>
-    <w:p>
-      <w:r>
-        <w:t>La estructura HTML esta impecable, destaco la correcta implementación de contenedores semánticos como main, section, footer, etc. El manejo de listas, textos y títulos es correcto.</w:t>
-      </w:r>
-    </w:p>
-    <w:p/>
-    <w:p>
-      <w:r>
-        <w:t>La manipulación de enlaces relativos o absolutos quedo perfecto. Genial que aplicaste pseudoclases para los enlaces.</w:t>
-      </w:r>
-    </w:p>
-    <w:p/>
-    <w:p>
-      <w:r>
-        <w:t>La vinculación de la página de estilos externa es correcta, buenisimo que usaste clases e id’s, quedo genial.</w:t>
-      </w:r>
-    </w:p>
-    <w:p/>
-    <w:p>
-      <w:r>
-        <w:t>Destaco que completaste los atributos alt de las imágenes, esto ayuda a mejorar la accesibilidad de sito web.</w:t>
-      </w:r>
-      <w:r>
-        <w:t xml:space="preserve"> Genial que aplicaste media queries para adaptar el ancho de las imágenes.</w:t>
-      </w:r>
-    </w:p>
-    <w:p/>
-    <w:p/>
-    <w:p>
-      <w:r>
-        <w:t xml:space="preserve">Tu nota en el Desafío 02 es: </w:t>
+        <w:t>Diego</w:t>
+      </w:r>
+      <w:r>
+        <w:t>, el trabajo realizado es excelente. Destaco la prolijidad del documento ¡</w:t>
+      </w:r>
+    </w:p>
+    <w:p/>
+    <w:p>
+      <w:r>
+        <w:t xml:space="preserve">La estructura HTML esta impecable, destaco la correcta implementación de contenedores semánticos como </w:t>
+      </w:r>
+      <w:proofErr w:type="spellStart"/>
+      <w:r>
+        <w:t>main</w:t>
+      </w:r>
+      <w:proofErr w:type="spellEnd"/>
+      <w:r>
+        <w:t xml:space="preserve">, </w:t>
+      </w:r>
+      <w:proofErr w:type="spellStart"/>
+      <w:r>
+        <w:t>section</w:t>
+      </w:r>
+      <w:proofErr w:type="spellEnd"/>
+      <w:r>
+        <w:t xml:space="preserve">, </w:t>
+      </w:r>
+      <w:proofErr w:type="spellStart"/>
+      <w:r>
+        <w:t>footer</w:t>
+      </w:r>
+      <w:proofErr w:type="spellEnd"/>
+      <w:r>
+        <w:t>, etc. El manejo de listas, textos y títulos es correcto.</w:t>
+      </w:r>
+    </w:p>
+    <w:p/>
+    <w:p>
+      <w:r>
+        <w:t xml:space="preserve">La barra de navegación principal quedo ok, los links configurados con estado </w:t>
+      </w:r>
+      <w:proofErr w:type="spellStart"/>
+      <w:r>
+        <w:t>hover</w:t>
+      </w:r>
+      <w:proofErr w:type="spellEnd"/>
+      <w:r>
+        <w:t xml:space="preserve"> como se solicitó.</w:t>
+      </w:r>
+    </w:p>
+    <w:p/>
+    <w:p>
+      <w:pPr>
+        <w:ind w:left="708" w:hanging="708"/>
+      </w:pPr>
+      <w:r>
+        <w:t xml:space="preserve">La implementación de Formularios es correcta, los campos con sus tipos de datos respectivos. Acá </w:t>
+      </w:r>
+      <w:r>
+        <w:t xml:space="preserve">la asociación de </w:t>
+      </w:r>
+      <w:proofErr w:type="spellStart"/>
+      <w:r>
+        <w:t>label</w:t>
+      </w:r>
+      <w:proofErr w:type="spellEnd"/>
+      <w:r>
+        <w:t xml:space="preserve"> e input a través de atributo </w:t>
+      </w:r>
+      <w:proofErr w:type="spellStart"/>
+      <w:r>
+        <w:t>for</w:t>
+      </w:r>
+      <w:proofErr w:type="spellEnd"/>
+      <w:r>
+        <w:t xml:space="preserve"> </w:t>
+      </w:r>
+      <w:r>
+        <w:t>e</w:t>
+      </w:r>
+      <w:r>
+        <w:t xml:space="preserve"> id respectivamente ayuda a mejorar la accesibilidad de tu sitio web.</w:t>
+      </w:r>
+    </w:p>
+    <w:p/>
+    <w:p>
+      <w:r>
+        <w:t xml:space="preserve">Los estilos solicitados tanto en colores, fuentes y dimensiones quedaron ok, también aplicaste correctamente las propiedades de box </w:t>
+      </w:r>
+      <w:proofErr w:type="spellStart"/>
+      <w:r>
+        <w:t>model</w:t>
+      </w:r>
+      <w:proofErr w:type="spellEnd"/>
+      <w:r>
+        <w:t xml:space="preserve">. EL </w:t>
+      </w:r>
+      <w:proofErr w:type="spellStart"/>
+      <w:r>
+        <w:t>layout</w:t>
+      </w:r>
+      <w:proofErr w:type="spellEnd"/>
+      <w:r>
+        <w:t xml:space="preserve"> quedó responsivo como se solicitó en enunciado.</w:t>
+      </w:r>
+    </w:p>
+    <w:p/>
+    <w:p/>
+    <w:p>
+      <w:r>
+        <w:t xml:space="preserve">Tu nota en el Desafío 03 es: </w:t>
       </w:r>
       <w:r>
         <w:rPr>
@@ -289,30 +475,51 @@
           <w:u w:val="single"/>
         </w:rPr>
       </w:pPr>
-      <w:r>
-        <w:rPr>
-          <w:rFonts w:ascii="Segoe UI Emoji" w:hAnsi="Segoe UI Emoji" w:cs="Segoe UI Emoji"/>
-          <w:b/>
-          <w:bCs/>
-        </w:rPr>
-        <w:t>Albarracin Agustin</w:t>
-      </w:r>
-    </w:p>
-    <w:p>
-      <w:pPr>
-        <w:rPr>
-          <w:rFonts w:ascii="Segoe UI Emoji" w:hAnsi="Segoe UI Emoji" w:cs="Segoe UI Emoji"/>
-          <w:b/>
-          <w:bCs/>
-        </w:rPr>
-      </w:pPr>
-    </w:p>
-    <w:p>
-      <w:pPr>
-        <w:rPr>
-          <w:rFonts w:ascii="Segoe UI Emoji" w:hAnsi="Segoe UI Emoji" w:cs="Segoe UI Emoji"/>
-        </w:rPr>
-      </w:pPr>
+      <w:proofErr w:type="spellStart"/>
+      <w:r>
+        <w:rPr>
+          <w:rFonts w:ascii="Segoe UI Emoji" w:hAnsi="Segoe UI Emoji" w:cs="Segoe UI Emoji"/>
+          <w:b/>
+          <w:bCs/>
+        </w:rPr>
+        <w:t>Albarracin</w:t>
+      </w:r>
+      <w:proofErr w:type="spellEnd"/>
+      <w:r>
+        <w:rPr>
+          <w:rFonts w:ascii="Segoe UI Emoji" w:hAnsi="Segoe UI Emoji" w:cs="Segoe UI Emoji"/>
+          <w:b/>
+          <w:bCs/>
+        </w:rPr>
+        <w:t xml:space="preserve"> </w:t>
+      </w:r>
+      <w:proofErr w:type="spellStart"/>
+      <w:r>
+        <w:rPr>
+          <w:rFonts w:ascii="Segoe UI Emoji" w:hAnsi="Segoe UI Emoji" w:cs="Segoe UI Emoji"/>
+          <w:b/>
+          <w:bCs/>
+        </w:rPr>
+        <w:t>Agustin</w:t>
+      </w:r>
+      <w:proofErr w:type="spellEnd"/>
+    </w:p>
+    <w:p>
+      <w:pPr>
+        <w:rPr>
+          <w:rFonts w:ascii="Segoe UI Emoji" w:hAnsi="Segoe UI Emoji" w:cs="Segoe UI Emoji"/>
+          <w:b/>
+          <w:bCs/>
+        </w:rPr>
+      </w:pPr>
+    </w:p>
+    <w:p>
+      <w:pPr>
+        <w:rPr>
+          <w:rFonts w:ascii="Segoe UI Emoji" w:hAnsi="Segoe UI Emoji" w:cs="Segoe UI Emoji"/>
+        </w:rPr>
+      </w:pPr>
+      <w:proofErr w:type="gramStart"/>
       <w:r>
         <w:rPr>
           <w:rFonts w:ascii="Segoe UI Emoji" w:hAnsi="Segoe UI Emoji" w:cs="Segoe UI Emoji"/>
@@ -320,7 +527,11 @@
         <w:t>🎉</w:t>
       </w:r>
       <w:r>
-        <w:t xml:space="preserve">¡Felicitaciones por la entrega del Desafío 03! </w:t>
+        <w:t>¡</w:t>
+      </w:r>
+      <w:proofErr w:type="gramEnd"/>
+      <w:r>
+        <w:t xml:space="preserve">Felicitaciones por la entrega del Desafío 03! </w:t>
       </w:r>
       <w:r>
         <w:rPr>
@@ -331,9 +542,11 @@
     </w:p>
     <w:p/>
     <w:p>
+      <w:proofErr w:type="spellStart"/>
       <w:r>
         <w:t>Agustin</w:t>
       </w:r>
+      <w:proofErr w:type="spellEnd"/>
       <w:r>
         <w:t>, el trabajo realizado es excelente. Destaco la prolijidad del documento ¡</w:t>
       </w:r>
@@ -341,13 +554,45 @@
     <w:p/>
     <w:p>
       <w:r>
-        <w:t>La estructura HTML esta impecable, destaco la correcta implementación de contenedores semánticos como main, section, footer, etc. El manejo de listas, textos y títulos es correcto.</w:t>
-      </w:r>
-    </w:p>
-    <w:p/>
-    <w:p>
-      <w:r>
-        <w:t>La barra de navegación principal quedo ok, los links configurados con estado hover como se solicitó.</w:t>
+        <w:t xml:space="preserve">La estructura HTML esta impecable, destaco la correcta implementación de contenedores semánticos como </w:t>
+      </w:r>
+      <w:proofErr w:type="spellStart"/>
+      <w:r>
+        <w:t>main</w:t>
+      </w:r>
+      <w:proofErr w:type="spellEnd"/>
+      <w:r>
+        <w:t xml:space="preserve">, </w:t>
+      </w:r>
+      <w:proofErr w:type="spellStart"/>
+      <w:r>
+        <w:t>section</w:t>
+      </w:r>
+      <w:proofErr w:type="spellEnd"/>
+      <w:r>
+        <w:t xml:space="preserve">, </w:t>
+      </w:r>
+      <w:proofErr w:type="spellStart"/>
+      <w:r>
+        <w:t>footer</w:t>
+      </w:r>
+      <w:proofErr w:type="spellEnd"/>
+      <w:r>
+        <w:t>, etc. El manejo de listas, textos y títulos es correcto.</w:t>
+      </w:r>
+    </w:p>
+    <w:p/>
+    <w:p>
+      <w:r>
+        <w:t xml:space="preserve">La barra de navegación principal quedo ok, los links configurados con estado </w:t>
+      </w:r>
+      <w:proofErr w:type="spellStart"/>
+      <w:r>
+        <w:t>hover</w:t>
+      </w:r>
+      <w:proofErr w:type="spellEnd"/>
+      <w:r>
+        <w:t xml:space="preserve"> como se solicitó.</w:t>
       </w:r>
     </w:p>
     <w:p/>
@@ -359,14 +604,29 @@
     <w:p/>
     <w:p>
       <w:r>
-        <w:t>Los estilos solicitados tanto en colores, fuentes y dimensiones quedaron ok, también aplicaste correctamente las propiedades de box model. EL layout quedó responsivo como se solicitó en enunciado.</w:t>
-      </w:r>
-    </w:p>
-    <w:p/>
-    <w:p/>
-    <w:p>
-      <w:r>
-        <w:lastRenderedPageBreak/>
+        <w:t xml:space="preserve">Los estilos solicitados tanto en colores, fuentes y dimensiones quedaron ok, también aplicaste correctamente las propiedades de box </w:t>
+      </w:r>
+      <w:proofErr w:type="spellStart"/>
+      <w:r>
+        <w:t>model</w:t>
+      </w:r>
+      <w:proofErr w:type="spellEnd"/>
+      <w:r>
+        <w:t xml:space="preserve">. EL </w:t>
+      </w:r>
+      <w:proofErr w:type="spellStart"/>
+      <w:r>
+        <w:t>layout</w:t>
+      </w:r>
+      <w:proofErr w:type="spellEnd"/>
+      <w:r>
+        <w:t xml:space="preserve"> quedó responsivo como se solicitó en enunciado.</w:t>
+      </w:r>
+    </w:p>
+    <w:p/>
+    <w:p/>
+    <w:p>
+      <w:r>
         <w:t xml:space="preserve">Tu nota en el Desafío 03 es: </w:t>
       </w:r>
       <w:r>
@@ -440,6 +700,7 @@
           <w:rFonts w:ascii="Segoe UI Emoji" w:hAnsi="Segoe UI Emoji" w:cs="Segoe UI Emoji"/>
         </w:rPr>
       </w:pPr>
+      <w:proofErr w:type="gramStart"/>
       <w:r>
         <w:rPr>
           <w:rFonts w:ascii="Segoe UI Emoji" w:hAnsi="Segoe UI Emoji" w:cs="Segoe UI Emoji"/>
@@ -447,7 +708,11 @@
         <w:t>🎉</w:t>
       </w:r>
       <w:r>
-        <w:t xml:space="preserve">¡Felicitaciones por la entrega del Desafío 03! </w:t>
+        <w:t>¡</w:t>
+      </w:r>
+      <w:proofErr w:type="gramEnd"/>
+      <w:r>
+        <w:t xml:space="preserve">Felicitaciones por la entrega del Desafío 03! </w:t>
       </w:r>
       <w:r>
         <w:rPr>
@@ -468,13 +733,45 @@
     <w:p/>
     <w:p>
       <w:r>
-        <w:t>La estructura HTML esta impecable, destaco la correcta implementación de contenedores semánticos como main, section, footer, etc. El manejo de listas, textos y títulos es correcto.</w:t>
-      </w:r>
-    </w:p>
-    <w:p/>
-    <w:p>
-      <w:r>
-        <w:t>La barra de navegación principal quedo ok, los links configurados con estado hover como se solicitó.</w:t>
+        <w:t xml:space="preserve">La estructura HTML esta impecable, destaco la correcta implementación de contenedores semánticos como </w:t>
+      </w:r>
+      <w:proofErr w:type="spellStart"/>
+      <w:r>
+        <w:t>main</w:t>
+      </w:r>
+      <w:proofErr w:type="spellEnd"/>
+      <w:r>
+        <w:t xml:space="preserve">, </w:t>
+      </w:r>
+      <w:proofErr w:type="spellStart"/>
+      <w:r>
+        <w:t>section</w:t>
+      </w:r>
+      <w:proofErr w:type="spellEnd"/>
+      <w:r>
+        <w:t xml:space="preserve">, </w:t>
+      </w:r>
+      <w:proofErr w:type="spellStart"/>
+      <w:r>
+        <w:t>footer</w:t>
+      </w:r>
+      <w:proofErr w:type="spellEnd"/>
+      <w:r>
+        <w:t>, etc. El manejo de listas, textos y títulos es correcto.</w:t>
+      </w:r>
+    </w:p>
+    <w:p/>
+    <w:p>
+      <w:r>
+        <w:t xml:space="preserve">La barra de navegación principal quedo ok, los links configurados con estado </w:t>
+      </w:r>
+      <w:proofErr w:type="spellStart"/>
+      <w:r>
+        <w:t>hover</w:t>
+      </w:r>
+      <w:proofErr w:type="spellEnd"/>
+      <w:r>
+        <w:t xml:space="preserve"> como se solicitó.</w:t>
       </w:r>
     </w:p>
     <w:p/>
@@ -486,7 +783,23 @@
     <w:p/>
     <w:p>
       <w:r>
-        <w:t>Los estilos solicitados tanto en colores, fuentes y dimensiones quedaron ok, también aplicaste correctamente las propiedades de box model. EL layout quedó responsivo como se solicitó en enunciado.</w:t>
+        <w:t xml:space="preserve">Los estilos solicitados tanto en colores, fuentes y dimensiones quedaron ok, también aplicaste correctamente las propiedades de box </w:t>
+      </w:r>
+      <w:proofErr w:type="spellStart"/>
+      <w:r>
+        <w:t>model</w:t>
+      </w:r>
+      <w:proofErr w:type="spellEnd"/>
+      <w:r>
+        <w:t xml:space="preserve">. EL </w:t>
+      </w:r>
+      <w:proofErr w:type="spellStart"/>
+      <w:r>
+        <w:t>layout</w:t>
+      </w:r>
+      <w:proofErr w:type="spellEnd"/>
+      <w:r>
+        <w:t xml:space="preserve"> quedó responsivo como se solicitó en enunciado.</w:t>
       </w:r>
     </w:p>
     <w:p/>
@@ -510,7 +823,39 @@
         </w:numPr>
       </w:pPr>
       <w:r>
-        <w:t>Mejora la accesibilidad de tu formulario asociar la etiqueta &lt;label&gt; con el elemento &lt;input&gt; (a través del atributo for en el label y el id en el input ) :</w:t>
+        <w:t>Mejora la accesibilidad de tu formulario asociar la etiqueta &lt;</w:t>
+      </w:r>
+      <w:proofErr w:type="spellStart"/>
+      <w:r>
+        <w:t>label</w:t>
+      </w:r>
+      <w:proofErr w:type="spellEnd"/>
+      <w:r>
+        <w:t xml:space="preserve">&gt; con el elemento &lt;input&gt; (a través del atributo </w:t>
+      </w:r>
+      <w:proofErr w:type="spellStart"/>
+      <w:r>
+        <w:t>for</w:t>
+      </w:r>
+      <w:proofErr w:type="spellEnd"/>
+      <w:r>
+        <w:t xml:space="preserve"> en el </w:t>
+      </w:r>
+      <w:proofErr w:type="spellStart"/>
+      <w:r>
+        <w:t>label</w:t>
+      </w:r>
+      <w:proofErr w:type="spellEnd"/>
+      <w:r>
+        <w:t xml:space="preserve"> y el id en el </w:t>
+      </w:r>
+      <w:proofErr w:type="gramStart"/>
+      <w:r>
+        <w:t>input )</w:t>
+      </w:r>
+      <w:proofErr w:type="gramEnd"/>
+      <w:r>
+        <w:t xml:space="preserve"> :</w:t>
       </w:r>
     </w:p>
     <w:p>
@@ -524,7 +869,31 @@
         <w:ind w:left="1416"/>
       </w:pPr>
       <w:r>
-        <w:t>&lt;label for="email"&gt;Correo electrónico:&lt;/label&gt;</w:t>
+        <w:t>&lt;</w:t>
+      </w:r>
+      <w:proofErr w:type="spellStart"/>
+      <w:r>
+        <w:t>label</w:t>
+      </w:r>
+      <w:proofErr w:type="spellEnd"/>
+      <w:r>
+        <w:t xml:space="preserve"> </w:t>
+      </w:r>
+      <w:proofErr w:type="spellStart"/>
+      <w:r>
+        <w:t>for</w:t>
+      </w:r>
+      <w:proofErr w:type="spellEnd"/>
+      <w:r>
+        <w:t>="email"&gt;Correo electrónico:&lt;/</w:t>
+      </w:r>
+      <w:proofErr w:type="spellStart"/>
+      <w:r>
+        <w:t>label</w:t>
+      </w:r>
+      <w:proofErr w:type="spellEnd"/>
+      <w:r>
+        <w:t>&gt;</w:t>
       </w:r>
     </w:p>
     <w:p>
@@ -568,7 +937,39 @@
         </w:numPr>
       </w:pPr>
       <w:r>
-        <w:t>Al redimensionar la pantalla te quedaron pegados los bordes de los contenedores a los márgenes ahi te convendria mejor aplicar solo un padding de 10px de izquierda y derecha a la etiqueta &lt;main&gt; y sacarle el width:100%:</w:t>
+        <w:t xml:space="preserve">Al redimensionar la pantalla te quedaron pegados los bordes de los contenedores a los márgenes </w:t>
+      </w:r>
+      <w:proofErr w:type="spellStart"/>
+      <w:r>
+        <w:t>ahi</w:t>
+      </w:r>
+      <w:proofErr w:type="spellEnd"/>
+      <w:r>
+        <w:t xml:space="preserve"> te </w:t>
+      </w:r>
+      <w:proofErr w:type="spellStart"/>
+      <w:r>
+        <w:t>convendria</w:t>
+      </w:r>
+      <w:proofErr w:type="spellEnd"/>
+      <w:r>
+        <w:t xml:space="preserve"> mejor aplicar solo un </w:t>
+      </w:r>
+      <w:proofErr w:type="spellStart"/>
+      <w:r>
+        <w:t>padding</w:t>
+      </w:r>
+      <w:proofErr w:type="spellEnd"/>
+      <w:r>
+        <w:t xml:space="preserve"> de 10px de izquierda y derecha a la etiqueta &lt;</w:t>
+      </w:r>
+      <w:proofErr w:type="spellStart"/>
+      <w:r>
+        <w:t>main</w:t>
+      </w:r>
+      <w:proofErr w:type="spellEnd"/>
+      <w:r>
+        <w:t>&gt; y sacarle el width:100%:</w:t>
       </w:r>
     </w:p>
     <w:p>
@@ -578,9 +979,18 @@
     </w:p>
     <w:p>
       <w:r>
-        <w:lastRenderedPageBreak/>
-        <w:t xml:space="preserve">                       main{</w:t>
-      </w:r>
+        <w:t xml:space="preserve">                       </w:t>
+      </w:r>
+      <w:proofErr w:type="spellStart"/>
+      <w:proofErr w:type="gramStart"/>
+      <w:r>
+        <w:t>main</w:t>
+      </w:r>
+      <w:proofErr w:type="spellEnd"/>
+      <w:r>
+        <w:t>{</w:t>
+      </w:r>
+      <w:proofErr w:type="gramEnd"/>
       <w:r>
         <w:tab/>
       </w:r>
@@ -603,8 +1013,13 @@
       <w:pPr>
         <w:ind w:left="1416"/>
       </w:pPr>
-      <w:r>
-        <w:t xml:space="preserve">padding: 0 10px; </w:t>
+      <w:proofErr w:type="spellStart"/>
+      <w:r>
+        <w:t>padding</w:t>
+      </w:r>
+      <w:proofErr w:type="spellEnd"/>
+      <w:r>
+        <w:t xml:space="preserve">: 0 10px; </w:t>
       </w:r>
     </w:p>
     <w:p>
@@ -674,7 +1089,25 @@
           <w:b/>
           <w:bCs/>
         </w:rPr>
-        <w:t xml:space="preserve">Figueroa Maidana Belen </w:t>
+        <w:t xml:space="preserve">Figueroa Maidana </w:t>
+      </w:r>
+      <w:proofErr w:type="spellStart"/>
+      <w:r>
+        <w:rPr>
+          <w:rFonts w:ascii="Segoe UI Emoji" w:hAnsi="Segoe UI Emoji" w:cs="Segoe UI Emoji"/>
+          <w:b/>
+          <w:bCs/>
+        </w:rPr>
+        <w:t>Belen</w:t>
+      </w:r>
+      <w:proofErr w:type="spellEnd"/>
+      <w:r>
+        <w:rPr>
+          <w:rFonts w:ascii="Segoe UI Emoji" w:hAnsi="Segoe UI Emoji" w:cs="Segoe UI Emoji"/>
+          <w:b/>
+          <w:bCs/>
+        </w:rPr>
+        <w:t xml:space="preserve"> </w:t>
       </w:r>
       <w:r>
         <w:rPr>
@@ -700,6 +1133,7 @@
           <w:rFonts w:ascii="Segoe UI Emoji" w:hAnsi="Segoe UI Emoji" w:cs="Segoe UI Emoji"/>
         </w:rPr>
       </w:pPr>
+      <w:proofErr w:type="gramStart"/>
       <w:r>
         <w:rPr>
           <w:rFonts w:ascii="Segoe UI Emoji" w:hAnsi="Segoe UI Emoji" w:cs="Segoe UI Emoji"/>
@@ -707,7 +1141,11 @@
         <w:t>🎉</w:t>
       </w:r>
       <w:r>
-        <w:t xml:space="preserve">¡Felicitaciones por la entrega del Desafío 03! </w:t>
+        <w:t>¡</w:t>
+      </w:r>
+      <w:proofErr w:type="gramEnd"/>
+      <w:r>
+        <w:t xml:space="preserve">Felicitaciones por la entrega del Desafío 03! </w:t>
       </w:r>
       <w:r>
         <w:rPr>
@@ -718,9 +1156,11 @@
     </w:p>
     <w:p/>
     <w:p>
+      <w:proofErr w:type="spellStart"/>
       <w:r>
         <w:t>Belen</w:t>
       </w:r>
+      <w:proofErr w:type="spellEnd"/>
       <w:r>
         <w:t xml:space="preserve">, el trabajo realizado es excelente. </w:t>
       </w:r>
@@ -728,7 +1168,31 @@
     <w:p/>
     <w:p>
       <w:r>
-        <w:t>La estructura HTML esta impecable, destaco la correcta implementación de contenedores semánticos como main, section, footer, etc. El manejo de listas, textos y títulos es correcto.</w:t>
+        <w:t xml:space="preserve">La estructura HTML esta impecable, destaco la correcta implementación de contenedores semánticos como </w:t>
+      </w:r>
+      <w:proofErr w:type="spellStart"/>
+      <w:r>
+        <w:t>main</w:t>
+      </w:r>
+      <w:proofErr w:type="spellEnd"/>
+      <w:r>
+        <w:t xml:space="preserve">, </w:t>
+      </w:r>
+      <w:proofErr w:type="spellStart"/>
+      <w:r>
+        <w:t>section</w:t>
+      </w:r>
+      <w:proofErr w:type="spellEnd"/>
+      <w:r>
+        <w:t xml:space="preserve">, </w:t>
+      </w:r>
+      <w:proofErr w:type="spellStart"/>
+      <w:r>
+        <w:t>footer</w:t>
+      </w:r>
+      <w:proofErr w:type="spellEnd"/>
+      <w:r>
+        <w:t>, etc. El manejo de listas, textos y títulos es correcto.</w:t>
       </w:r>
     </w:p>
     <w:p/>
@@ -740,7 +1204,15 @@
         <w:t>enlaces</w:t>
       </w:r>
       <w:r>
-        <w:t xml:space="preserve"> configurados con estado hover como se solicitó.</w:t>
+        <w:t xml:space="preserve"> configurados con estado </w:t>
+      </w:r>
+      <w:proofErr w:type="spellStart"/>
+      <w:r>
+        <w:t>hover</w:t>
+      </w:r>
+      <w:proofErr w:type="spellEnd"/>
+      <w:r>
+        <w:t xml:space="preserve"> como se solicitó.</w:t>
       </w:r>
     </w:p>
     <w:p/>
@@ -752,13 +1224,30 @@
     <w:p/>
     <w:p>
       <w:r>
-        <w:t>Los estilos solicitados tanto en colores, fuentes y dimensiones quedaron ok, también aplicaste correctamente las propiedades de box model. EL layout quedó responsivo como se solicitó en enunciado.</w:t>
-      </w:r>
-    </w:p>
-    <w:p/>
-    <w:p/>
-    <w:p>
-      <w:r>
+        <w:t xml:space="preserve">Los estilos solicitados tanto en colores, fuentes y dimensiones quedaron ok, también aplicaste correctamente las propiedades de box </w:t>
+      </w:r>
+      <w:proofErr w:type="spellStart"/>
+      <w:r>
+        <w:t>model</w:t>
+      </w:r>
+      <w:proofErr w:type="spellEnd"/>
+      <w:r>
+        <w:t xml:space="preserve">. EL </w:t>
+      </w:r>
+      <w:proofErr w:type="spellStart"/>
+      <w:r>
+        <w:t>layout</w:t>
+      </w:r>
+      <w:proofErr w:type="spellEnd"/>
+      <w:r>
+        <w:t xml:space="preserve"> quedó responsivo como se solicitó en enunciado.</w:t>
+      </w:r>
+    </w:p>
+    <w:p/>
+    <w:p/>
+    <w:p>
+      <w:r>
+        <w:lastRenderedPageBreak/>
         <w:t xml:space="preserve">Tu nota en el Desafío 03 es: </w:t>
       </w:r>
       <w:r>
@@ -799,24 +1288,61 @@
           <w:b/>
           <w:bCs/>
         </w:rPr>
-        <w:t>Segovia Rodriguez Estefani Lujan</w:t>
-      </w:r>
-    </w:p>
-    <w:p>
-      <w:pPr>
-        <w:rPr>
-          <w:rFonts w:ascii="Segoe UI Emoji" w:hAnsi="Segoe UI Emoji" w:cs="Segoe UI Emoji"/>
-          <w:b/>
-          <w:bCs/>
-        </w:rPr>
-      </w:pPr>
-    </w:p>
-    <w:p>
-      <w:pPr>
-        <w:rPr>
-          <w:rFonts w:ascii="Segoe UI Emoji" w:hAnsi="Segoe UI Emoji" w:cs="Segoe UI Emoji"/>
-        </w:rPr>
-      </w:pPr>
+        <w:t xml:space="preserve">Segovia </w:t>
+      </w:r>
+      <w:proofErr w:type="spellStart"/>
+      <w:r>
+        <w:rPr>
+          <w:rFonts w:ascii="Segoe UI Emoji" w:hAnsi="Segoe UI Emoji" w:cs="Segoe UI Emoji"/>
+          <w:b/>
+          <w:bCs/>
+        </w:rPr>
+        <w:t>Rodriguez</w:t>
+      </w:r>
+      <w:proofErr w:type="spellEnd"/>
+      <w:r>
+        <w:rPr>
+          <w:rFonts w:ascii="Segoe UI Emoji" w:hAnsi="Segoe UI Emoji" w:cs="Segoe UI Emoji"/>
+          <w:b/>
+          <w:bCs/>
+        </w:rPr>
+        <w:t xml:space="preserve"> </w:t>
+      </w:r>
+      <w:proofErr w:type="spellStart"/>
+      <w:r>
+        <w:rPr>
+          <w:rFonts w:ascii="Segoe UI Emoji" w:hAnsi="Segoe UI Emoji" w:cs="Segoe UI Emoji"/>
+          <w:b/>
+          <w:bCs/>
+        </w:rPr>
+        <w:t>Estefani</w:t>
+      </w:r>
+      <w:proofErr w:type="spellEnd"/>
+      <w:r>
+        <w:rPr>
+          <w:rFonts w:ascii="Segoe UI Emoji" w:hAnsi="Segoe UI Emoji" w:cs="Segoe UI Emoji"/>
+          <w:b/>
+          <w:bCs/>
+        </w:rPr>
+        <w:t xml:space="preserve"> Lujan</w:t>
+      </w:r>
+    </w:p>
+    <w:p>
+      <w:pPr>
+        <w:rPr>
+          <w:rFonts w:ascii="Segoe UI Emoji" w:hAnsi="Segoe UI Emoji" w:cs="Segoe UI Emoji"/>
+          <w:b/>
+          <w:bCs/>
+        </w:rPr>
+      </w:pPr>
+    </w:p>
+    <w:p>
+      <w:pPr>
+        <w:rPr>
+          <w:rFonts w:ascii="Segoe UI Emoji" w:hAnsi="Segoe UI Emoji" w:cs="Segoe UI Emoji"/>
+        </w:rPr>
+      </w:pPr>
+      <w:proofErr w:type="gramStart"/>
       <w:r>
         <w:rPr>
           <w:rFonts w:ascii="Segoe UI Emoji" w:hAnsi="Segoe UI Emoji" w:cs="Segoe UI Emoji"/>
@@ -824,7 +1350,11 @@
         <w:t>🎉</w:t>
       </w:r>
       <w:r>
-        <w:t xml:space="preserve">¡Felicitaciones por la entrega del Desafío 03! </w:t>
+        <w:t>¡</w:t>
+      </w:r>
+      <w:proofErr w:type="gramEnd"/>
+      <w:r>
+        <w:t xml:space="preserve">Felicitaciones por la entrega del Desafío 03! </w:t>
       </w:r>
       <w:r>
         <w:rPr>
@@ -835,9 +1365,11 @@
     </w:p>
     <w:p/>
     <w:p>
+      <w:proofErr w:type="spellStart"/>
       <w:r>
         <w:t>Estefani</w:t>
       </w:r>
+      <w:proofErr w:type="spellEnd"/>
       <w:r>
         <w:t>, el trabajo realizado es excelente.</w:t>
       </w:r>
@@ -845,13 +1377,45 @@
     <w:p/>
     <w:p>
       <w:r>
-        <w:t>La estructura HTML esta impecable, destaco la correcta implementación de contenedores semánticos como main, section, footer, etc. El manejo de listas, textos y títulos es correcto.</w:t>
-      </w:r>
-    </w:p>
-    <w:p/>
-    <w:p>
-      <w:r>
-        <w:t>La barra de navegación principal quedo ok, los links configurados con estado hover como se solicitó.</w:t>
+        <w:t xml:space="preserve">La estructura HTML esta impecable, destaco la correcta implementación de contenedores semánticos como </w:t>
+      </w:r>
+      <w:proofErr w:type="spellStart"/>
+      <w:r>
+        <w:t>main</w:t>
+      </w:r>
+      <w:proofErr w:type="spellEnd"/>
+      <w:r>
+        <w:t xml:space="preserve">, </w:t>
+      </w:r>
+      <w:proofErr w:type="spellStart"/>
+      <w:r>
+        <w:t>section</w:t>
+      </w:r>
+      <w:proofErr w:type="spellEnd"/>
+      <w:r>
+        <w:t xml:space="preserve">, </w:t>
+      </w:r>
+      <w:proofErr w:type="spellStart"/>
+      <w:r>
+        <w:t>footer</w:t>
+      </w:r>
+      <w:proofErr w:type="spellEnd"/>
+      <w:r>
+        <w:t>, etc. El manejo de listas, textos y títulos es correcto.</w:t>
+      </w:r>
+    </w:p>
+    <w:p/>
+    <w:p>
+      <w:r>
+        <w:t xml:space="preserve">La barra de navegación principal quedo ok, los links configurados con estado </w:t>
+      </w:r>
+      <w:proofErr w:type="spellStart"/>
+      <w:r>
+        <w:t>hover</w:t>
+      </w:r>
+      <w:proofErr w:type="spellEnd"/>
+      <w:r>
+        <w:t xml:space="preserve"> como se solicitó.</w:t>
       </w:r>
     </w:p>
     <w:p/>
@@ -863,7 +1427,23 @@
     <w:p/>
     <w:p>
       <w:r>
-        <w:t>Los estilos solicitados tanto en colores, fuentes y dimensiones quedaron ok, también aplicaste correctamente las propiedades de box model. EL layout quedó responsivo como se solicitó en enunciado.</w:t>
+        <w:t xml:space="preserve">Los estilos solicitados tanto en colores, fuentes y dimensiones quedaron ok, también aplicaste correctamente las propiedades de box </w:t>
+      </w:r>
+      <w:proofErr w:type="spellStart"/>
+      <w:r>
+        <w:t>model</w:t>
+      </w:r>
+      <w:proofErr w:type="spellEnd"/>
+      <w:r>
+        <w:t xml:space="preserve">. EL </w:t>
+      </w:r>
+      <w:proofErr w:type="spellStart"/>
+      <w:r>
+        <w:t>layout</w:t>
+      </w:r>
+      <w:proofErr w:type="spellEnd"/>
+      <w:r>
+        <w:t xml:space="preserve"> quedó responsivo como se solicitó en enunciado.</w:t>
       </w:r>
     </w:p>
     <w:p/>
@@ -882,8 +1462,37 @@
           <w:numId w:val="1"/>
         </w:numPr>
       </w:pPr>
-      <w:r>
-        <w:t>Recordá cambiar el lenguaje a español &lt;html lang="es"&gt; porque esto le dice a los motores de búsqueda en que idioma esta tu sitio web.</w:t>
+      <w:proofErr w:type="spellStart"/>
+      <w:r>
+        <w:t>Recordá</w:t>
+      </w:r>
+      <w:proofErr w:type="spellEnd"/>
+      <w:r>
+        <w:t xml:space="preserve"> cambiar el lenguaje a español &lt;</w:t>
+      </w:r>
+      <w:proofErr w:type="spellStart"/>
+      <w:r>
+        <w:t>html</w:t>
+      </w:r>
+      <w:proofErr w:type="spellEnd"/>
+      <w:r>
+        <w:t xml:space="preserve"> </w:t>
+      </w:r>
+      <w:proofErr w:type="spellStart"/>
+      <w:r>
+        <w:t>lang</w:t>
+      </w:r>
+      <w:proofErr w:type="spellEnd"/>
+      <w:r>
+        <w:t xml:space="preserve">="es"&gt; porque esto </w:t>
+      </w:r>
+      <w:proofErr w:type="gramStart"/>
+      <w:r>
+        <w:t>le</w:t>
+      </w:r>
+      <w:proofErr w:type="gramEnd"/>
+      <w:r>
+        <w:t xml:space="preserve"> dice a los motores de búsqueda en que idioma esta tu sitio web.</w:t>
       </w:r>
     </w:p>
     <w:p>
@@ -903,7 +1512,39 @@
         <w:t>M</w:t>
       </w:r>
       <w:r>
-        <w:t>ejora la accesibilidad de tu formulario asociar la etiqueta &lt;label&gt; con el elemento &lt;input&gt; (a través del atributo for en el label y el id en el input ) :</w:t>
+        <w:t>ejora la accesibilidad de tu formulario asociar la etiqueta &lt;</w:t>
+      </w:r>
+      <w:proofErr w:type="spellStart"/>
+      <w:r>
+        <w:t>label</w:t>
+      </w:r>
+      <w:proofErr w:type="spellEnd"/>
+      <w:r>
+        <w:t xml:space="preserve">&gt; con el elemento &lt;input&gt; (a través del atributo </w:t>
+      </w:r>
+      <w:proofErr w:type="spellStart"/>
+      <w:r>
+        <w:t>for</w:t>
+      </w:r>
+      <w:proofErr w:type="spellEnd"/>
+      <w:r>
+        <w:t xml:space="preserve"> en el </w:t>
+      </w:r>
+      <w:proofErr w:type="spellStart"/>
+      <w:r>
+        <w:t>label</w:t>
+      </w:r>
+      <w:proofErr w:type="spellEnd"/>
+      <w:r>
+        <w:t xml:space="preserve"> y el id en el </w:t>
+      </w:r>
+      <w:proofErr w:type="gramStart"/>
+      <w:r>
+        <w:t>input )</w:t>
+      </w:r>
+      <w:proofErr w:type="gramEnd"/>
+      <w:r>
+        <w:t xml:space="preserve"> :</w:t>
       </w:r>
     </w:p>
     <w:p>
@@ -917,12 +1558,79 @@
         <w:ind w:left="1416"/>
       </w:pPr>
     </w:p>
-    <w:p/>
-    <w:p/>
-    <w:p/>
-    <w:p>
-      <w:r>
-        <w:lastRenderedPageBreak/>
+    <w:p>
+      <w:pPr>
+        <w:ind w:left="2124"/>
+      </w:pPr>
+      <w:r>
+        <w:t>&lt;</w:t>
+      </w:r>
+      <w:proofErr w:type="spellStart"/>
+      <w:r>
+        <w:t>label</w:t>
+      </w:r>
+      <w:proofErr w:type="spellEnd"/>
+      <w:r>
+        <w:t xml:space="preserve"> </w:t>
+      </w:r>
+      <w:proofErr w:type="spellStart"/>
+      <w:r>
+        <w:t>for</w:t>
+      </w:r>
+      <w:proofErr w:type="spellEnd"/>
+      <w:r>
+        <w:t>="email"&gt;Email&lt;/</w:t>
+      </w:r>
+      <w:proofErr w:type="spellStart"/>
+      <w:r>
+        <w:t>label</w:t>
+      </w:r>
+      <w:proofErr w:type="spellEnd"/>
+      <w:r>
+        <w:t>&gt;</w:t>
+      </w:r>
+    </w:p>
+    <w:p>
+      <w:pPr>
+        <w:ind w:left="2124"/>
+      </w:pPr>
+      <w:r>
+        <w:t xml:space="preserve">&lt;input </w:t>
+      </w:r>
+      <w:proofErr w:type="spellStart"/>
+      <w:r>
+        <w:t>type</w:t>
+      </w:r>
+      <w:proofErr w:type="spellEnd"/>
+      <w:r>
+        <w:t xml:space="preserve">="email" id="email" </w:t>
+      </w:r>
+      <w:proofErr w:type="spellStart"/>
+      <w:r>
+        <w:t>required</w:t>
+      </w:r>
+      <w:proofErr w:type="spellEnd"/>
+      <w:r>
+        <w:t xml:space="preserve"> </w:t>
+      </w:r>
+      <w:proofErr w:type="spellStart"/>
+      <w:r>
+        <w:t>placeholder</w:t>
+      </w:r>
+      <w:proofErr w:type="spellEnd"/>
+      <w:r>
+        <w:t>="ejemplo@correo.com" &gt;</w:t>
+      </w:r>
+    </w:p>
+    <w:p>
+      <w:pPr>
+        <w:ind w:left="1416"/>
+      </w:pPr>
+    </w:p>
+    <w:p/>
+    <w:p/>
+    <w:p>
+      <w:r>
         <w:t xml:space="preserve">Tu nota en el Desafío 03 es: </w:t>
       </w:r>
       <w:r>
@@ -976,6 +1684,7 @@
           <w:rFonts w:ascii="Segoe UI Emoji" w:hAnsi="Segoe UI Emoji" w:cs="Segoe UI Emoji"/>
         </w:rPr>
       </w:pPr>
+      <w:proofErr w:type="gramStart"/>
       <w:r>
         <w:rPr>
           <w:rFonts w:ascii="Segoe UI Emoji" w:hAnsi="Segoe UI Emoji" w:cs="Segoe UI Emoji"/>
@@ -983,7 +1692,11 @@
         <w:t>🎉</w:t>
       </w:r>
       <w:r>
-        <w:t xml:space="preserve">¡Felicitaciones por la entrega del Desafío 03! </w:t>
+        <w:t>¡</w:t>
+      </w:r>
+      <w:proofErr w:type="gramEnd"/>
+      <w:r>
+        <w:t xml:space="preserve">Felicitaciones por la entrega del Desafío 03! </w:t>
       </w:r>
       <w:r>
         <w:rPr>
@@ -995,22 +1708,51 @@
     <w:p/>
     <w:p>
       <w:r>
-        <w:t>Carlos</w:t>
-      </w:r>
-      <w:r>
-        <w:t>, el trabajo realizado es excelente. Destaco la prolijidad del documento ¡</w:t>
-      </w:r>
-    </w:p>
-    <w:p/>
-    <w:p>
-      <w:r>
-        <w:t>La estructura HTML esta impecable, destaco la correcta implementación de contenedores semánticos como main, section, footer, etc. El manejo de listas, textos y títulos es correcto.</w:t>
-      </w:r>
-    </w:p>
-    <w:p/>
-    <w:p>
-      <w:r>
-        <w:t>La barra de navegación principal quedo ok, los links configurados con estado hover como se solicitó.</w:t>
+        <w:t>Carlos, el trabajo realizado es excelente. Destaco la prolijidad del documento ¡</w:t>
+      </w:r>
+    </w:p>
+    <w:p/>
+    <w:p>
+      <w:r>
+        <w:t xml:space="preserve">La estructura HTML esta impecable, destaco la correcta implementación de contenedores semánticos como </w:t>
+      </w:r>
+      <w:proofErr w:type="spellStart"/>
+      <w:r>
+        <w:t>main</w:t>
+      </w:r>
+      <w:proofErr w:type="spellEnd"/>
+      <w:r>
+        <w:t xml:space="preserve">, </w:t>
+      </w:r>
+      <w:proofErr w:type="spellStart"/>
+      <w:r>
+        <w:t>section</w:t>
+      </w:r>
+      <w:proofErr w:type="spellEnd"/>
+      <w:r>
+        <w:t xml:space="preserve">, </w:t>
+      </w:r>
+      <w:proofErr w:type="spellStart"/>
+      <w:r>
+        <w:t>footer</w:t>
+      </w:r>
+      <w:proofErr w:type="spellEnd"/>
+      <w:r>
+        <w:t>, etc. El manejo de listas, textos y títulos es correcto.</w:t>
+      </w:r>
+    </w:p>
+    <w:p/>
+    <w:p>
+      <w:r>
+        <w:t xml:space="preserve">La barra de navegación principal quedo ok, los links configurados con estado </w:t>
+      </w:r>
+      <w:proofErr w:type="spellStart"/>
+      <w:r>
+        <w:t>hover</w:t>
+      </w:r>
+      <w:proofErr w:type="spellEnd"/>
+      <w:r>
+        <w:t xml:space="preserve"> como se solicitó.</w:t>
       </w:r>
     </w:p>
     <w:p/>
@@ -1022,7 +1764,23 @@
     <w:p/>
     <w:p>
       <w:r>
-        <w:t>Los estilos solicitados tanto en colores, fuentes y dimensiones quedaron ok, también aplicaste correctamente las propiedades de box model. EL layout quedó responsivo como se solicitó en enunciado.</w:t>
+        <w:t xml:space="preserve">Los estilos solicitados tanto en colores, fuentes y dimensiones quedaron ok, también aplicaste correctamente las propiedades de box </w:t>
+      </w:r>
+      <w:proofErr w:type="spellStart"/>
+      <w:r>
+        <w:t>model</w:t>
+      </w:r>
+      <w:proofErr w:type="spellEnd"/>
+      <w:r>
+        <w:t xml:space="preserve">. EL </w:t>
+      </w:r>
+      <w:proofErr w:type="spellStart"/>
+      <w:r>
+        <w:t>layout</w:t>
+      </w:r>
+      <w:proofErr w:type="spellEnd"/>
+      <w:r>
+        <w:t xml:space="preserve"> quedó responsivo como se solicitó en enunciado.</w:t>
       </w:r>
     </w:p>
     <w:p/>
@@ -1056,30 +1814,42 @@
           <w:bCs/>
         </w:rPr>
       </w:pPr>
-      <w:r>
-        <w:rPr>
-          <w:rFonts w:ascii="Segoe UI Emoji" w:hAnsi="Segoe UI Emoji" w:cs="Segoe UI Emoji"/>
-          <w:b/>
-          <w:bCs/>
-        </w:rPr>
-        <w:t>Chiapello Gianluca</w:t>
-      </w:r>
-    </w:p>
-    <w:p>
-      <w:pPr>
-        <w:rPr>
-          <w:rFonts w:ascii="Segoe UI Emoji" w:hAnsi="Segoe UI Emoji" w:cs="Segoe UI Emoji"/>
-          <w:b/>
-          <w:bCs/>
-        </w:rPr>
-      </w:pPr>
-    </w:p>
-    <w:p>
-      <w:pPr>
-        <w:rPr>
-          <w:rFonts w:ascii="Segoe UI Emoji" w:hAnsi="Segoe UI Emoji" w:cs="Segoe UI Emoji"/>
-        </w:rPr>
-      </w:pPr>
+      <w:proofErr w:type="spellStart"/>
+      <w:r>
+        <w:rPr>
+          <w:rFonts w:ascii="Segoe UI Emoji" w:hAnsi="Segoe UI Emoji" w:cs="Segoe UI Emoji"/>
+          <w:b/>
+          <w:bCs/>
+        </w:rPr>
+        <w:lastRenderedPageBreak/>
+        <w:t>Chiapello</w:t>
+      </w:r>
+      <w:proofErr w:type="spellEnd"/>
+      <w:r>
+        <w:rPr>
+          <w:rFonts w:ascii="Segoe UI Emoji" w:hAnsi="Segoe UI Emoji" w:cs="Segoe UI Emoji"/>
+          <w:b/>
+          <w:bCs/>
+        </w:rPr>
+        <w:t xml:space="preserve"> Gianluca</w:t>
+      </w:r>
+    </w:p>
+    <w:p>
+      <w:pPr>
+        <w:rPr>
+          <w:rFonts w:ascii="Segoe UI Emoji" w:hAnsi="Segoe UI Emoji" w:cs="Segoe UI Emoji"/>
+          <w:b/>
+          <w:bCs/>
+        </w:rPr>
+      </w:pPr>
+    </w:p>
+    <w:p>
+      <w:pPr>
+        <w:rPr>
+          <w:rFonts w:ascii="Segoe UI Emoji" w:hAnsi="Segoe UI Emoji" w:cs="Segoe UI Emoji"/>
+        </w:rPr>
+      </w:pPr>
+      <w:proofErr w:type="gramStart"/>
       <w:r>
         <w:rPr>
           <w:rFonts w:ascii="Segoe UI Emoji" w:hAnsi="Segoe UI Emoji" w:cs="Segoe UI Emoji"/>
@@ -1087,7 +1857,11 @@
         <w:t>🎉</w:t>
       </w:r>
       <w:r>
-        <w:t xml:space="preserve">¡Felicitaciones por la entrega del Desafío 03! </w:t>
+        <w:t>¡</w:t>
+      </w:r>
+      <w:proofErr w:type="gramEnd"/>
+      <w:r>
+        <w:t xml:space="preserve">Felicitaciones por la entrega del Desafío 03! </w:t>
       </w:r>
       <w:r>
         <w:rPr>
@@ -1098,9 +1872,11 @@
     </w:p>
     <w:p/>
     <w:p>
+      <w:proofErr w:type="spellStart"/>
       <w:r>
         <w:t>Goanluca</w:t>
       </w:r>
+      <w:proofErr w:type="spellEnd"/>
       <w:r>
         <w:t>, el trabajo realizado es excelente. Destaco la prolijidad del documento ¡</w:t>
       </w:r>
@@ -1108,13 +1884,45 @@
     <w:p/>
     <w:p>
       <w:r>
-        <w:t>La estructura HTML esta impecable, destaco la correcta implementación de contenedores semánticos como main, section, footer, etc. El manejo de listas, textos y títulos es correcto.</w:t>
-      </w:r>
-    </w:p>
-    <w:p/>
-    <w:p>
-      <w:r>
-        <w:t>La barra de navegación principal quedo ok, los links configurados con estado hover como se solicitó.</w:t>
+        <w:t xml:space="preserve">La estructura HTML esta impecable, destaco la correcta implementación de contenedores semánticos como </w:t>
+      </w:r>
+      <w:proofErr w:type="spellStart"/>
+      <w:r>
+        <w:t>main</w:t>
+      </w:r>
+      <w:proofErr w:type="spellEnd"/>
+      <w:r>
+        <w:t xml:space="preserve">, </w:t>
+      </w:r>
+      <w:proofErr w:type="spellStart"/>
+      <w:r>
+        <w:t>section</w:t>
+      </w:r>
+      <w:proofErr w:type="spellEnd"/>
+      <w:r>
+        <w:t xml:space="preserve">, </w:t>
+      </w:r>
+      <w:proofErr w:type="spellStart"/>
+      <w:r>
+        <w:t>footer</w:t>
+      </w:r>
+      <w:proofErr w:type="spellEnd"/>
+      <w:r>
+        <w:t>, etc. El manejo de listas, textos y títulos es correcto.</w:t>
+      </w:r>
+    </w:p>
+    <w:p/>
+    <w:p>
+      <w:r>
+        <w:t xml:space="preserve">La barra de navegación principal quedo ok, los links configurados con estado </w:t>
+      </w:r>
+      <w:proofErr w:type="spellStart"/>
+      <w:r>
+        <w:t>hover</w:t>
+      </w:r>
+      <w:proofErr w:type="spellEnd"/>
+      <w:r>
+        <w:t xml:space="preserve"> como se solicitó.</w:t>
       </w:r>
     </w:p>
     <w:p/>
@@ -1126,7 +1934,23 @@
     <w:p/>
     <w:p>
       <w:r>
-        <w:t>Los estilos solicitados tanto en colores, fuentes y dimensiones quedaron ok, también aplicaste correctamente las propiedades de box model. EL layout quedó responsivo como se solicitó en enunciado.</w:t>
+        <w:t xml:space="preserve">Los estilos solicitados tanto en colores, fuentes y dimensiones quedaron ok, también aplicaste correctamente las propiedades de box </w:t>
+      </w:r>
+      <w:proofErr w:type="spellStart"/>
+      <w:r>
+        <w:t>model</w:t>
+      </w:r>
+      <w:proofErr w:type="spellEnd"/>
+      <w:r>
+        <w:t xml:space="preserve">. EL </w:t>
+      </w:r>
+      <w:proofErr w:type="spellStart"/>
+      <w:r>
+        <w:t>layout</w:t>
+      </w:r>
+      <w:proofErr w:type="spellEnd"/>
+      <w:r>
+        <w:t xml:space="preserve"> quedó responsivo como se solicitó en enunciado.</w:t>
       </w:r>
     </w:p>
     <w:p/>
@@ -1189,35 +2013,79 @@
     </w:p>
     <w:p>
       <w:r>
-        <w:t>Santino</w:t>
-      </w:r>
-      <w:r>
-        <w:t>, el resultado logrado es muy bueno, te felicito.</w:t>
-      </w:r>
-    </w:p>
-    <w:p/>
-    <w:p>
-      <w:r>
-        <w:t>La estructura HTML esta impecable, destaco la correcta implementación de contenedores semánticos como main, section, footer, etc. El manejo de listas, textos y títulos es correcto.</w:t>
-      </w:r>
-    </w:p>
-    <w:p/>
-    <w:p>
-      <w:r>
-        <w:t>La barra de navegación principal quedo ok, los links configurados con estado hover como se solicitó.</w:t>
-      </w:r>
-    </w:p>
-    <w:p/>
-    <w:p>
-      <w:r>
-        <w:lastRenderedPageBreak/>
+        <w:t>Santino, el resultado logrado es muy bueno, te felicito.</w:t>
+      </w:r>
+    </w:p>
+    <w:p/>
+    <w:p>
+      <w:r>
+        <w:t xml:space="preserve">La estructura HTML esta impecable, destaco la correcta implementación de contenedores semánticos como </w:t>
+      </w:r>
+      <w:proofErr w:type="spellStart"/>
+      <w:r>
+        <w:t>main</w:t>
+      </w:r>
+      <w:proofErr w:type="spellEnd"/>
+      <w:r>
+        <w:t xml:space="preserve">, </w:t>
+      </w:r>
+      <w:proofErr w:type="spellStart"/>
+      <w:r>
+        <w:t>section</w:t>
+      </w:r>
+      <w:proofErr w:type="spellEnd"/>
+      <w:r>
+        <w:t xml:space="preserve">, </w:t>
+      </w:r>
+      <w:proofErr w:type="spellStart"/>
+      <w:r>
+        <w:t>footer</w:t>
+      </w:r>
+      <w:proofErr w:type="spellEnd"/>
+      <w:r>
+        <w:t>, etc. El manejo de listas, textos y títulos es correcto.</w:t>
+      </w:r>
+    </w:p>
+    <w:p/>
+    <w:p>
+      <w:r>
+        <w:t xml:space="preserve">La barra de navegación principal quedo ok, los links configurados con estado </w:t>
+      </w:r>
+      <w:proofErr w:type="spellStart"/>
+      <w:r>
+        <w:t>hover</w:t>
+      </w:r>
+      <w:proofErr w:type="spellEnd"/>
+      <w:r>
+        <w:t xml:space="preserve"> como se solicitó.</w:t>
+      </w:r>
+    </w:p>
+    <w:p/>
+    <w:p>
+      <w:r>
         <w:t xml:space="preserve">La implementación de Formularios es correcta, los campos con sus tipos de datos respectivos. </w:t>
       </w:r>
     </w:p>
     <w:p/>
     <w:p>
       <w:r>
-        <w:t>Los estilos solicitados tanto en colores, fuentes y dimensiones quedaron ok, también aplicaste correctamente las propiedades de box model. EL layout quedó responsivo como se solicitó en enunciado.</w:t>
+        <w:t xml:space="preserve">Los estilos solicitados tanto en colores, fuentes y dimensiones quedaron ok, también aplicaste correctamente las propiedades de box </w:t>
+      </w:r>
+      <w:proofErr w:type="spellStart"/>
+      <w:r>
+        <w:t>model</w:t>
+      </w:r>
+      <w:proofErr w:type="spellEnd"/>
+      <w:r>
+        <w:t xml:space="preserve">. EL </w:t>
+      </w:r>
+      <w:proofErr w:type="spellStart"/>
+      <w:r>
+        <w:t>layout</w:t>
+      </w:r>
+      <w:proofErr w:type="spellEnd"/>
+      <w:r>
+        <w:t xml:space="preserve"> quedó responsivo como se solicitó en enunciado.</w:t>
       </w:r>
     </w:p>
     <w:p/>
@@ -1242,7 +2110,39 @@
         </w:numPr>
       </w:pPr>
       <w:r>
-        <w:t>Las imágenes están bien creadas, destaco que completaste el atributo alt de las mismas, una mejora para que no se deformen al redimensionar la pantalla es aplicar por css la propiedad “object-fit: cover” con esto te aseguras que sin importar que las proporciones de la imagen y el contenedor coincidan de ultima que la imagen se recorte pero que no llegue a deformarse.</w:t>
+        <w:t xml:space="preserve">Las imágenes están bien creadas, destaco que completaste el atributo </w:t>
+      </w:r>
+      <w:proofErr w:type="spellStart"/>
+      <w:r>
+        <w:t>alt</w:t>
+      </w:r>
+      <w:proofErr w:type="spellEnd"/>
+      <w:r>
+        <w:t xml:space="preserve"> de las mismas, una mejora para que no se deformen al redimensionar la pantalla es aplicar por </w:t>
+      </w:r>
+      <w:proofErr w:type="spellStart"/>
+      <w:r>
+        <w:t>css</w:t>
+      </w:r>
+      <w:proofErr w:type="spellEnd"/>
+      <w:r>
+        <w:t xml:space="preserve"> la propiedad “</w:t>
+      </w:r>
+      <w:proofErr w:type="spellStart"/>
+      <w:r>
+        <w:t>object-fit</w:t>
+      </w:r>
+      <w:proofErr w:type="spellEnd"/>
+      <w:r>
+        <w:t xml:space="preserve">: </w:t>
+      </w:r>
+      <w:proofErr w:type="spellStart"/>
+      <w:r>
+        <w:t>cover</w:t>
+      </w:r>
+      <w:proofErr w:type="spellEnd"/>
+      <w:r>
+        <w:t>” con esto te aseguras que sin importar que las proporciones de la imagen y el contenedor coincidan de ultima que la imagen se recorte pero que no llegue a deformarse.</w:t>
       </w:r>
     </w:p>
     <w:p/>
@@ -1276,30 +2176,51 @@
           <w:bCs/>
         </w:rPr>
       </w:pPr>
-      <w:r>
-        <w:rPr>
-          <w:rFonts w:ascii="Segoe UI Emoji" w:hAnsi="Segoe UI Emoji" w:cs="Segoe UI Emoji"/>
-          <w:b/>
-          <w:bCs/>
-        </w:rPr>
-        <w:t>Vernengo Hipolito</w:t>
-      </w:r>
-    </w:p>
-    <w:p>
-      <w:pPr>
-        <w:rPr>
-          <w:rFonts w:ascii="Segoe UI Emoji" w:hAnsi="Segoe UI Emoji" w:cs="Segoe UI Emoji"/>
-          <w:b/>
-          <w:bCs/>
-        </w:rPr>
-      </w:pPr>
-    </w:p>
-    <w:p>
-      <w:pPr>
-        <w:rPr>
-          <w:rFonts w:ascii="Segoe UI Emoji" w:hAnsi="Segoe UI Emoji" w:cs="Segoe UI Emoji"/>
-        </w:rPr>
-      </w:pPr>
+      <w:proofErr w:type="spellStart"/>
+      <w:r>
+        <w:rPr>
+          <w:rFonts w:ascii="Segoe UI Emoji" w:hAnsi="Segoe UI Emoji" w:cs="Segoe UI Emoji"/>
+          <w:b/>
+          <w:bCs/>
+        </w:rPr>
+        <w:t>Vernengo</w:t>
+      </w:r>
+      <w:proofErr w:type="spellEnd"/>
+      <w:r>
+        <w:rPr>
+          <w:rFonts w:ascii="Segoe UI Emoji" w:hAnsi="Segoe UI Emoji" w:cs="Segoe UI Emoji"/>
+          <w:b/>
+          <w:bCs/>
+        </w:rPr>
+        <w:t xml:space="preserve"> </w:t>
+      </w:r>
+      <w:proofErr w:type="spellStart"/>
+      <w:r>
+        <w:rPr>
+          <w:rFonts w:ascii="Segoe UI Emoji" w:hAnsi="Segoe UI Emoji" w:cs="Segoe UI Emoji"/>
+          <w:b/>
+          <w:bCs/>
+        </w:rPr>
+        <w:t>Hipolito</w:t>
+      </w:r>
+      <w:proofErr w:type="spellEnd"/>
+    </w:p>
+    <w:p>
+      <w:pPr>
+        <w:rPr>
+          <w:rFonts w:ascii="Segoe UI Emoji" w:hAnsi="Segoe UI Emoji" w:cs="Segoe UI Emoji"/>
+          <w:b/>
+          <w:bCs/>
+        </w:rPr>
+      </w:pPr>
+    </w:p>
+    <w:p>
+      <w:pPr>
+        <w:rPr>
+          <w:rFonts w:ascii="Segoe UI Emoji" w:hAnsi="Segoe UI Emoji" w:cs="Segoe UI Emoji"/>
+        </w:rPr>
+      </w:pPr>
+      <w:proofErr w:type="gramStart"/>
       <w:r>
         <w:rPr>
           <w:rFonts w:ascii="Segoe UI Emoji" w:hAnsi="Segoe UI Emoji" w:cs="Segoe UI Emoji"/>
@@ -1307,7 +2228,11 @@
         <w:t>🎉</w:t>
       </w:r>
       <w:r>
-        <w:t xml:space="preserve">¡Felicitaciones por la entrega del Desafío 03! </w:t>
+        <w:t>¡</w:t>
+      </w:r>
+      <w:proofErr w:type="gramEnd"/>
+      <w:r>
+        <w:t xml:space="preserve">Felicitaciones por la entrega del Desafío 03! </w:t>
       </w:r>
       <w:r>
         <w:rPr>
@@ -1318,20 +2243,58 @@
     </w:p>
     <w:p/>
     <w:p>
-      <w:r>
-        <w:t>Hipolito, el trabajo realizado es excelente. Destaco la prolijidad del documento ¡</w:t>
-      </w:r>
-    </w:p>
-    <w:p/>
-    <w:p>
-      <w:r>
-        <w:t>La estructura HTML esta impecable, destaco la correcta implementación de contenedores semánticos como main, section, footer, etc. El manejo de listas, textos y títulos es correcto.</w:t>
-      </w:r>
-    </w:p>
-    <w:p/>
-    <w:p>
-      <w:r>
-        <w:t>La barra de navegación principal quedo ok, los links configurados con estado hover como se solicitó.</w:t>
+      <w:proofErr w:type="spellStart"/>
+      <w:r>
+        <w:t>Hipolito</w:t>
+      </w:r>
+      <w:proofErr w:type="spellEnd"/>
+      <w:r>
+        <w:t>, el trabajo realizado es excelente. Destaco la prolijidad del documento ¡</w:t>
+      </w:r>
+    </w:p>
+    <w:p/>
+    <w:p>
+      <w:r>
+        <w:t xml:space="preserve">La estructura HTML esta impecable, destaco la correcta implementación de contenedores semánticos como </w:t>
+      </w:r>
+      <w:proofErr w:type="spellStart"/>
+      <w:r>
+        <w:t>main</w:t>
+      </w:r>
+      <w:proofErr w:type="spellEnd"/>
+      <w:r>
+        <w:t xml:space="preserve">, </w:t>
+      </w:r>
+      <w:proofErr w:type="spellStart"/>
+      <w:r>
+        <w:t>section</w:t>
+      </w:r>
+      <w:proofErr w:type="spellEnd"/>
+      <w:r>
+        <w:t xml:space="preserve">, </w:t>
+      </w:r>
+      <w:proofErr w:type="spellStart"/>
+      <w:r>
+        <w:t>footer</w:t>
+      </w:r>
+      <w:proofErr w:type="spellEnd"/>
+      <w:r>
+        <w:t>, etc. El manejo de listas, textos y títulos es correcto.</w:t>
+      </w:r>
+    </w:p>
+    <w:p/>
+    <w:p>
+      <w:r>
+        <w:lastRenderedPageBreak/>
+        <w:t xml:space="preserve">La barra de navegación principal quedo ok, los links configurados con estado </w:t>
+      </w:r>
+      <w:proofErr w:type="spellStart"/>
+      <w:r>
+        <w:t>hover</w:t>
+      </w:r>
+      <w:proofErr w:type="spellEnd"/>
+      <w:r>
+        <w:t xml:space="preserve"> como se solicitó.</w:t>
       </w:r>
     </w:p>
     <w:p/>
@@ -1343,7 +2306,23 @@
     <w:p/>
     <w:p>
       <w:r>
-        <w:t>Los estilos solicitados tanto en colores, fuentes y dimensiones quedaron ok, también aplicaste correctamente las propiedades de box model. EL layout quedó responsivo como se solicitó en enunciado.</w:t>
+        <w:t xml:space="preserve">Los estilos solicitados tanto en colores, fuentes y dimensiones quedaron ok, también aplicaste correctamente las propiedades de box </w:t>
+      </w:r>
+      <w:proofErr w:type="spellStart"/>
+      <w:r>
+        <w:t>model</w:t>
+      </w:r>
+      <w:proofErr w:type="spellEnd"/>
+      <w:r>
+        <w:t xml:space="preserve">. EL </w:t>
+      </w:r>
+      <w:proofErr w:type="spellStart"/>
+      <w:r>
+        <w:t>layout</w:t>
+      </w:r>
+      <w:proofErr w:type="spellEnd"/>
+      <w:r>
+        <w:t xml:space="preserve"> quedó responsivo como se solicitó en enunciado.</w:t>
       </w:r>
     </w:p>
     <w:p/>
@@ -1407,6 +2386,7 @@
           <w:rFonts w:ascii="Segoe UI Emoji" w:hAnsi="Segoe UI Emoji" w:cs="Segoe UI Emoji"/>
         </w:rPr>
       </w:pPr>
+      <w:proofErr w:type="gramStart"/>
       <w:r>
         <w:rPr>
           <w:rFonts w:ascii="Segoe UI Emoji" w:hAnsi="Segoe UI Emoji" w:cs="Segoe UI Emoji"/>
@@ -1414,7 +2394,11 @@
         <w:t>🎉</w:t>
       </w:r>
       <w:r>
-        <w:t xml:space="preserve">¡Felicitaciones por la entrega del Desafío 03! </w:t>
+        <w:t>¡</w:t>
+      </w:r>
+      <w:proofErr w:type="gramEnd"/>
+      <w:r>
+        <w:t xml:space="preserve">Felicitaciones por la entrega del Desafío 03! </w:t>
       </w:r>
       <w:r>
         <w:rPr>
@@ -1426,19 +2410,60 @@
     <w:p/>
     <w:p>
       <w:r>
-        <w:t xml:space="preserve">Belen, el trabajo realizado es excelente. </w:t>
-      </w:r>
-    </w:p>
-    <w:p/>
-    <w:p>
-      <w:r>
-        <w:t>La estructura HTML esta impecable, destaco la correcta implementación de contenedores semánticos como main, section, footer, etc. El manejo de listas, textos y títulos es correcto.</w:t>
-      </w:r>
-    </w:p>
-    <w:p/>
-    <w:p>
-      <w:r>
-        <w:t>La barra de navegación principal quedo ok, los enlaces configurados con estado hover como se solicitó.</w:t>
+        <w:t>Tomas</w:t>
+      </w:r>
+      <w:r>
+        <w:t xml:space="preserve">, </w:t>
+      </w:r>
+      <w:r>
+        <w:t>el resultado logrado es muy bueno, te felicito</w:t>
+      </w:r>
+      <w:r>
+        <w:t xml:space="preserve">. </w:t>
+      </w:r>
+    </w:p>
+    <w:p/>
+    <w:p>
+      <w:r>
+        <w:t xml:space="preserve">La estructura HTML esta impecable, destaco la correcta implementación de contenedores semánticos como </w:t>
+      </w:r>
+      <w:proofErr w:type="spellStart"/>
+      <w:r>
+        <w:t>main</w:t>
+      </w:r>
+      <w:proofErr w:type="spellEnd"/>
+      <w:r>
+        <w:t xml:space="preserve">, </w:t>
+      </w:r>
+      <w:proofErr w:type="spellStart"/>
+      <w:r>
+        <w:t>section</w:t>
+      </w:r>
+      <w:proofErr w:type="spellEnd"/>
+      <w:r>
+        <w:t xml:space="preserve">, </w:t>
+      </w:r>
+      <w:proofErr w:type="spellStart"/>
+      <w:r>
+        <w:t>footer</w:t>
+      </w:r>
+      <w:proofErr w:type="spellEnd"/>
+      <w:r>
+        <w:t>, etc. El manejo de listas, textos y títulos es correcto.</w:t>
+      </w:r>
+    </w:p>
+    <w:p/>
+    <w:p>
+      <w:r>
+        <w:t xml:space="preserve">La barra de navegación principal quedo ok, los enlaces configurados con estado </w:t>
+      </w:r>
+      <w:proofErr w:type="spellStart"/>
+      <w:r>
+        <w:t>hover</w:t>
+      </w:r>
+      <w:proofErr w:type="spellEnd"/>
+      <w:r>
+        <w:t xml:space="preserve"> como se solicitó.</w:t>
       </w:r>
     </w:p>
     <w:p/>
@@ -1450,7 +2475,23 @@
     <w:p/>
     <w:p>
       <w:r>
-        <w:t>Los estilos solicitados tanto en colores, fuentes y dimensiones quedaron ok, también aplicaste correctamente las propiedades de box model. EL layout quedó responsivo como se solicitó en enunciado.</w:t>
+        <w:t xml:space="preserve">Los estilos solicitados tanto en colores, fuentes y dimensiones quedaron ok, también aplicaste correctamente las propiedades de box </w:t>
+      </w:r>
+      <w:proofErr w:type="spellStart"/>
+      <w:r>
+        <w:t>model</w:t>
+      </w:r>
+      <w:proofErr w:type="spellEnd"/>
+      <w:r>
+        <w:t xml:space="preserve">. EL </w:t>
+      </w:r>
+      <w:proofErr w:type="spellStart"/>
+      <w:r>
+        <w:t>layout</w:t>
+      </w:r>
+      <w:proofErr w:type="spellEnd"/>
+      <w:r>
+        <w:t xml:space="preserve"> quedó responsivo como se solicitó en enunciado.</w:t>
       </w:r>
     </w:p>
     <w:p/>
@@ -1469,7 +2510,23 @@
         </w:numPr>
       </w:pPr>
       <w:r>
-        <w:t>Al redimensionar la pantalla queda espacio notorio en los márgenes laterales, para que te quede similar a las imágenes del enunciado te convenia mejor aplicar solo un padding de 10px de izquierda y derecha a la etiqueta &lt;main&gt; y sacar el width:50%:</w:t>
+        <w:t xml:space="preserve">Al redimensionar la pantalla queda espacio notorio en los márgenes laterales, para que te quede similar a las imágenes del enunciado te convenia mejor aplicar solo un </w:t>
+      </w:r>
+      <w:proofErr w:type="spellStart"/>
+      <w:r>
+        <w:t>padding</w:t>
+      </w:r>
+      <w:proofErr w:type="spellEnd"/>
+      <w:r>
+        <w:t xml:space="preserve"> de 10px de izquierda y derecha a la etiqueta &lt;</w:t>
+      </w:r>
+      <w:proofErr w:type="spellStart"/>
+      <w:r>
+        <w:t>main</w:t>
+      </w:r>
+      <w:proofErr w:type="spellEnd"/>
+      <w:r>
+        <w:t>&gt; y sacar el width:50%:</w:t>
       </w:r>
     </w:p>
     <w:p>
@@ -1479,9 +2536,18 @@
     </w:p>
     <w:p>
       <w:r>
-        <w:lastRenderedPageBreak/>
-        <w:t xml:space="preserve">                       main{</w:t>
-      </w:r>
+        <w:t xml:space="preserve">                       </w:t>
+      </w:r>
+      <w:proofErr w:type="spellStart"/>
+      <w:proofErr w:type="gramStart"/>
+      <w:r>
+        <w:t>main</w:t>
+      </w:r>
+      <w:proofErr w:type="spellEnd"/>
+      <w:r>
+        <w:t>{</w:t>
+      </w:r>
+      <w:proofErr w:type="gramEnd"/>
       <w:r>
         <w:tab/>
       </w:r>
@@ -1496,8 +2562,13 @@
       <w:pPr>
         <w:ind w:left="1416"/>
       </w:pPr>
-      <w:r>
-        <w:t xml:space="preserve">padding: 0 10px; </w:t>
+      <w:proofErr w:type="spellStart"/>
+      <w:r>
+        <w:t>padding</w:t>
+      </w:r>
+      <w:proofErr w:type="spellEnd"/>
+      <w:r>
+        <w:t xml:space="preserve">: 0 10px; </w:t>
       </w:r>
     </w:p>
     <w:p>
@@ -1576,6 +2647,7 @@
           <w:rFonts w:ascii="Segoe UI Emoji" w:hAnsi="Segoe UI Emoji" w:cs="Segoe UI Emoji"/>
         </w:rPr>
       </w:pPr>
+      <w:proofErr w:type="gramStart"/>
       <w:r>
         <w:rPr>
           <w:rFonts w:ascii="Segoe UI Emoji" w:hAnsi="Segoe UI Emoji" w:cs="Segoe UI Emoji"/>
@@ -1583,7 +2655,11 @@
         <w:t>🎉</w:t>
       </w:r>
       <w:r>
-        <w:t xml:space="preserve">¡Felicitaciones por la entrega del Desafío 03! </w:t>
+        <w:t>¡</w:t>
+      </w:r>
+      <w:proofErr w:type="gramEnd"/>
+      <w:r>
+        <w:t xml:space="preserve">Felicitaciones por la entrega del Desafío 03! </w:t>
       </w:r>
       <w:r>
         <w:rPr>
@@ -1607,13 +2683,45 @@
     <w:p/>
     <w:p>
       <w:r>
-        <w:t>La estructura HTML esta impecable, destaco la correcta implementación de contenedores semánticos como main, section, footer, etc. El manejo de listas, textos y títulos es correcto.</w:t>
-      </w:r>
-    </w:p>
-    <w:p/>
-    <w:p>
-      <w:r>
-        <w:t>La barra de navegación principal quedo ok, los links configurados con estado hover como se solicitó.</w:t>
+        <w:t xml:space="preserve">La estructura HTML esta impecable, destaco la correcta implementación de contenedores semánticos como </w:t>
+      </w:r>
+      <w:proofErr w:type="spellStart"/>
+      <w:r>
+        <w:t>main</w:t>
+      </w:r>
+      <w:proofErr w:type="spellEnd"/>
+      <w:r>
+        <w:t xml:space="preserve">, </w:t>
+      </w:r>
+      <w:proofErr w:type="spellStart"/>
+      <w:r>
+        <w:t>section</w:t>
+      </w:r>
+      <w:proofErr w:type="spellEnd"/>
+      <w:r>
+        <w:t xml:space="preserve">, </w:t>
+      </w:r>
+      <w:proofErr w:type="spellStart"/>
+      <w:r>
+        <w:t>footer</w:t>
+      </w:r>
+      <w:proofErr w:type="spellEnd"/>
+      <w:r>
+        <w:t>, etc. El manejo de listas, textos y títulos es correcto.</w:t>
+      </w:r>
+    </w:p>
+    <w:p/>
+    <w:p>
+      <w:r>
+        <w:t xml:space="preserve">La barra de navegación principal quedo ok, los links configurados con estado </w:t>
+      </w:r>
+      <w:proofErr w:type="spellStart"/>
+      <w:r>
+        <w:t>hover</w:t>
+      </w:r>
+      <w:proofErr w:type="spellEnd"/>
+      <w:r>
+        <w:t xml:space="preserve"> como se solicitó.</w:t>
       </w:r>
     </w:p>
     <w:p/>
@@ -1625,13 +2733,30 @@
     <w:p/>
     <w:p>
       <w:r>
-        <w:t>Los estilos solicitados tanto en colores, fuentes y dimensiones quedaron ok, también aplicaste correctamente las propiedades de box model. EL layout quedó responsivo como se solicitó en enunciado.</w:t>
-      </w:r>
-    </w:p>
-    <w:p/>
-    <w:p/>
-    <w:p>
-      <w:r>
+        <w:t xml:space="preserve">Los estilos solicitados tanto en colores, fuentes y dimensiones quedaron ok, también aplicaste correctamente las propiedades de box </w:t>
+      </w:r>
+      <w:proofErr w:type="spellStart"/>
+      <w:r>
+        <w:t>model</w:t>
+      </w:r>
+      <w:proofErr w:type="spellEnd"/>
+      <w:r>
+        <w:t xml:space="preserve">. EL </w:t>
+      </w:r>
+      <w:proofErr w:type="spellStart"/>
+      <w:r>
+        <w:t>layout</w:t>
+      </w:r>
+      <w:proofErr w:type="spellEnd"/>
+      <w:r>
+        <w:t xml:space="preserve"> quedó responsivo como se solicitó en enunciado.</w:t>
+      </w:r>
+    </w:p>
+    <w:p/>
+    <w:p/>
+    <w:p>
+      <w:r>
+        <w:lastRenderedPageBreak/>
         <w:t>Observaciones:</w:t>
       </w:r>
     </w:p>
@@ -1650,11 +2775,39 @@
         </w:numPr>
       </w:pPr>
       <w:r>
-        <w:t xml:space="preserve">Las imágenes están bien creadas, destaco que completaste el atributo alt de las mismas, una mejora para que no se deformen al redimensionar la pantalla es aplicar por css la propiedad “object-fit: cover” con esto te aseguras que sin importar que las </w:t>
-      </w:r>
-      <w:r>
-        <w:lastRenderedPageBreak/>
-        <w:t>proporciones de la imagen y el contenedor coincidan de ultima que la imagen se recorte pero que no llegue a deformarse.</w:t>
+        <w:t xml:space="preserve">Las imágenes están bien creadas, destaco que completaste el atributo </w:t>
+      </w:r>
+      <w:proofErr w:type="spellStart"/>
+      <w:r>
+        <w:t>alt</w:t>
+      </w:r>
+      <w:proofErr w:type="spellEnd"/>
+      <w:r>
+        <w:t xml:space="preserve"> de las mismas, una mejora para que no se deformen al redimensionar la pantalla es aplicar por </w:t>
+      </w:r>
+      <w:proofErr w:type="spellStart"/>
+      <w:r>
+        <w:t>css</w:t>
+      </w:r>
+      <w:proofErr w:type="spellEnd"/>
+      <w:r>
+        <w:t xml:space="preserve"> la propiedad “</w:t>
+      </w:r>
+      <w:proofErr w:type="spellStart"/>
+      <w:r>
+        <w:t>object-fit</w:t>
+      </w:r>
+      <w:proofErr w:type="spellEnd"/>
+      <w:r>
+        <w:t xml:space="preserve">: </w:t>
+      </w:r>
+      <w:proofErr w:type="spellStart"/>
+      <w:r>
+        <w:t>cover</w:t>
+      </w:r>
+      <w:proofErr w:type="spellEnd"/>
+      <w:r>
+        <w:t>” con esto te aseguras que sin importar que las proporciones de la imagen y el contenedor coincidan de ultima que la imagen se recorte pero que no llegue a deformarse.</w:t>
       </w:r>
     </w:p>
     <w:p>
@@ -1671,7 +2824,23 @@
         </w:numPr>
       </w:pPr>
       <w:r>
-        <w:t>Es recomendable utilizar en lugar de un div la etiqueta &lt;form&gt; que tiene valor semántico y ayuda a los lectores entender que esa parte es un formulario.</w:t>
+        <w:t xml:space="preserve">Es recomendable utilizar en lugar de un </w:t>
+      </w:r>
+      <w:proofErr w:type="spellStart"/>
+      <w:r>
+        <w:t>div</w:t>
+      </w:r>
+      <w:proofErr w:type="spellEnd"/>
+      <w:r>
+        <w:t xml:space="preserve"> la etiqueta &lt;</w:t>
+      </w:r>
+      <w:proofErr w:type="spellStart"/>
+      <w:r>
+        <w:t>form</w:t>
+      </w:r>
+      <w:proofErr w:type="spellEnd"/>
+      <w:r>
+        <w:t>&gt; que tiene valor semántico y ayuda a los lectores entender que esa parte es un formulario.</w:t>
       </w:r>
     </w:p>
     <w:p/>
@@ -1706,45 +2875,81 @@
           <w:bCs/>
         </w:rPr>
       </w:pPr>
-      <w:r>
-        <w:rPr>
-          <w:rFonts w:ascii="Segoe UI Emoji" w:hAnsi="Segoe UI Emoji" w:cs="Segoe UI Emoji"/>
-          <w:b/>
-          <w:bCs/>
-        </w:rPr>
-        <w:t>Perezlindo Franco</w:t>
-      </w:r>
-    </w:p>
-    <w:p>
-      <w:pPr>
-        <w:rPr>
-          <w:rFonts w:ascii="Segoe UI Emoji" w:hAnsi="Segoe UI Emoji" w:cs="Segoe UI Emoji"/>
-          <w:b/>
-          <w:bCs/>
-        </w:rPr>
-      </w:pPr>
-    </w:p>
-    <w:p>
-      <w:r>
-        <w:t>Franco</w:t>
-      </w:r>
-      <w:r>
-        <w:t>, el</w:t>
-      </w:r>
-      <w:r>
-        <w:t xml:space="preserve"> resultado logrado es muy bueno, te felicito.</w:t>
-      </w:r>
-    </w:p>
-    <w:p/>
-    <w:p>
-      <w:r>
-        <w:t>La estructura HTML esta impecable, destaco la correcta implementación de contenedores semánticos como main, section, footer, etc. El manejo de listas, textos y títulos es correcto.</w:t>
-      </w:r>
-    </w:p>
-    <w:p/>
-    <w:p>
-      <w:r>
-        <w:t>La barra de navegación principal quedo ok, los links configurados con estado hover como se solicitó.</w:t>
+      <w:proofErr w:type="spellStart"/>
+      <w:r>
+        <w:rPr>
+          <w:rFonts w:ascii="Segoe UI Emoji" w:hAnsi="Segoe UI Emoji" w:cs="Segoe UI Emoji"/>
+          <w:b/>
+          <w:bCs/>
+        </w:rPr>
+        <w:t>Perezlindo</w:t>
+      </w:r>
+      <w:proofErr w:type="spellEnd"/>
+      <w:r>
+        <w:rPr>
+          <w:rFonts w:ascii="Segoe UI Emoji" w:hAnsi="Segoe UI Emoji" w:cs="Segoe UI Emoji"/>
+          <w:b/>
+          <w:bCs/>
+        </w:rPr>
+        <w:t xml:space="preserve"> Franco</w:t>
+      </w:r>
+    </w:p>
+    <w:p>
+      <w:pPr>
+        <w:rPr>
+          <w:rFonts w:ascii="Segoe UI Emoji" w:hAnsi="Segoe UI Emoji" w:cs="Segoe UI Emoji"/>
+          <w:b/>
+          <w:bCs/>
+        </w:rPr>
+      </w:pPr>
+    </w:p>
+    <w:p>
+      <w:r>
+        <w:t>Franco, el resultado logrado es muy bueno, te felicito.</w:t>
+      </w:r>
+    </w:p>
+    <w:p/>
+    <w:p>
+      <w:r>
+        <w:t xml:space="preserve">La estructura HTML esta impecable, destaco la correcta implementación de contenedores semánticos como </w:t>
+      </w:r>
+      <w:proofErr w:type="spellStart"/>
+      <w:r>
+        <w:t>main</w:t>
+      </w:r>
+      <w:proofErr w:type="spellEnd"/>
+      <w:r>
+        <w:t xml:space="preserve">, </w:t>
+      </w:r>
+      <w:proofErr w:type="spellStart"/>
+      <w:r>
+        <w:t>section</w:t>
+      </w:r>
+      <w:proofErr w:type="spellEnd"/>
+      <w:r>
+        <w:t xml:space="preserve">, </w:t>
+      </w:r>
+      <w:proofErr w:type="spellStart"/>
+      <w:r>
+        <w:t>footer</w:t>
+      </w:r>
+      <w:proofErr w:type="spellEnd"/>
+      <w:r>
+        <w:t>, etc. El manejo de listas, textos y títulos es correcto.</w:t>
+      </w:r>
+    </w:p>
+    <w:p/>
+    <w:p>
+      <w:r>
+        <w:t xml:space="preserve">La barra de navegación principal quedo ok, los links configurados con estado </w:t>
+      </w:r>
+      <w:proofErr w:type="spellStart"/>
+      <w:r>
+        <w:t>hover</w:t>
+      </w:r>
+      <w:proofErr w:type="spellEnd"/>
+      <w:r>
+        <w:t xml:space="preserve"> como se solicitó.</w:t>
       </w:r>
     </w:p>
     <w:p/>
@@ -1756,13 +2961,30 @@
     <w:p/>
     <w:p>
       <w:r>
-        <w:t>Los estilos solicitados tanto en colores, fuentes y dimensiones quedaron ok, también aplicaste correctamente las propiedades de box model. EL layout quedó responsivo como se solicitó en enunciado.</w:t>
-      </w:r>
-    </w:p>
-    <w:p/>
-    <w:p/>
-    <w:p>
-      <w:r>
+        <w:t xml:space="preserve">Los estilos solicitados tanto en colores, fuentes y dimensiones quedaron ok, también aplicaste correctamente las propiedades de box </w:t>
+      </w:r>
+      <w:proofErr w:type="spellStart"/>
+      <w:r>
+        <w:t>model</w:t>
+      </w:r>
+      <w:proofErr w:type="spellEnd"/>
+      <w:r>
+        <w:t xml:space="preserve">. EL </w:t>
+      </w:r>
+      <w:proofErr w:type="spellStart"/>
+      <w:r>
+        <w:t>layout</w:t>
+      </w:r>
+      <w:proofErr w:type="spellEnd"/>
+      <w:r>
+        <w:t xml:space="preserve"> quedó responsivo como se solicitó en enunciado.</w:t>
+      </w:r>
+    </w:p>
+    <w:p/>
+    <w:p/>
+    <w:p>
+      <w:r>
+        <w:lastRenderedPageBreak/>
         <w:t>Observaciones:</w:t>
       </w:r>
     </w:p>
@@ -1781,11 +3003,39 @@
         </w:numPr>
       </w:pPr>
       <w:r>
-        <w:t xml:space="preserve">Las imágenes están bien creadas, destaco que completaste el atributo alt de las mismas, una mejora para que no se deformen al redimensionar la pantalla es aplicar por css la propiedad “object-fit: cover” con esto te aseguras que sin importar que las </w:t>
-      </w:r>
-      <w:r>
-        <w:lastRenderedPageBreak/>
-        <w:t>proporciones de la imagen y el contenedor coincidan de ultima que la imagen se recorte pero que no llegue a deformarse.</w:t>
+        <w:t xml:space="preserve">Las imágenes están bien creadas, destaco que completaste el atributo </w:t>
+      </w:r>
+      <w:proofErr w:type="spellStart"/>
+      <w:r>
+        <w:t>alt</w:t>
+      </w:r>
+      <w:proofErr w:type="spellEnd"/>
+      <w:r>
+        <w:t xml:space="preserve"> de las mismas, una mejora para que no se deformen al redimensionar la pantalla es aplicar por </w:t>
+      </w:r>
+      <w:proofErr w:type="spellStart"/>
+      <w:r>
+        <w:t>css</w:t>
+      </w:r>
+      <w:proofErr w:type="spellEnd"/>
+      <w:r>
+        <w:t xml:space="preserve"> la propiedad “</w:t>
+      </w:r>
+      <w:proofErr w:type="spellStart"/>
+      <w:r>
+        <w:t>object-fit</w:t>
+      </w:r>
+      <w:proofErr w:type="spellEnd"/>
+      <w:r>
+        <w:t xml:space="preserve">: </w:t>
+      </w:r>
+      <w:proofErr w:type="spellStart"/>
+      <w:r>
+        <w:t>cover</w:t>
+      </w:r>
+      <w:proofErr w:type="spellEnd"/>
+      <w:r>
+        <w:t>” con esto te aseguras que sin importar que las proporciones de la imagen y el contenedor coincidan de ultima que la imagen se recorte pero que no llegue a deformarse.</w:t>
       </w:r>
     </w:p>
     <w:p>
@@ -1802,7 +3052,23 @@
         </w:numPr>
       </w:pPr>
       <w:r>
-        <w:t>Es recomendable utilizar en lugar de un div la etiqueta &lt;form&gt; que tiene valor semántico y ayuda a los lectores entender que esa parte es un formulario.</w:t>
+        <w:t xml:space="preserve">Es recomendable utilizar en lugar de un </w:t>
+      </w:r>
+      <w:proofErr w:type="spellStart"/>
+      <w:r>
+        <w:t>div</w:t>
+      </w:r>
+      <w:proofErr w:type="spellEnd"/>
+      <w:r>
+        <w:t xml:space="preserve"> la etiqueta &lt;</w:t>
+      </w:r>
+      <w:proofErr w:type="spellStart"/>
+      <w:r>
+        <w:t>form</w:t>
+      </w:r>
+      <w:proofErr w:type="spellEnd"/>
+      <w:r>
+        <w:t>&gt; que tiene valor semántico y ayuda a los lectores entender que esa parte es un formulario.</w:t>
       </w:r>
     </w:p>
     <w:p/>
@@ -1843,30 +3109,69 @@
           <w:bCs/>
         </w:rPr>
       </w:pPr>
-      <w:r>
-        <w:rPr>
-          <w:rFonts w:ascii="Segoe UI Emoji" w:hAnsi="Segoe UI Emoji" w:cs="Segoe UI Emoji"/>
-          <w:b/>
-          <w:bCs/>
-        </w:rPr>
-        <w:t>Zuñiga Hernandez Carlos Andres</w:t>
-      </w:r>
-    </w:p>
-    <w:p>
-      <w:pPr>
-        <w:rPr>
-          <w:rFonts w:ascii="Segoe UI Emoji" w:hAnsi="Segoe UI Emoji" w:cs="Segoe UI Emoji"/>
-          <w:b/>
-          <w:bCs/>
-        </w:rPr>
-      </w:pPr>
-    </w:p>
-    <w:p>
-      <w:pPr>
-        <w:rPr>
-          <w:rFonts w:ascii="Segoe UI Emoji" w:hAnsi="Segoe UI Emoji" w:cs="Segoe UI Emoji"/>
-        </w:rPr>
-      </w:pPr>
+      <w:proofErr w:type="spellStart"/>
+      <w:r>
+        <w:rPr>
+          <w:rFonts w:ascii="Segoe UI Emoji" w:hAnsi="Segoe UI Emoji" w:cs="Segoe UI Emoji"/>
+          <w:b/>
+          <w:bCs/>
+        </w:rPr>
+        <w:t>Zuñiga</w:t>
+      </w:r>
+      <w:proofErr w:type="spellEnd"/>
+      <w:r>
+        <w:rPr>
+          <w:rFonts w:ascii="Segoe UI Emoji" w:hAnsi="Segoe UI Emoji" w:cs="Segoe UI Emoji"/>
+          <w:b/>
+          <w:bCs/>
+        </w:rPr>
+        <w:t xml:space="preserve"> </w:t>
+      </w:r>
+      <w:proofErr w:type="spellStart"/>
+      <w:r>
+        <w:rPr>
+          <w:rFonts w:ascii="Segoe UI Emoji" w:hAnsi="Segoe UI Emoji" w:cs="Segoe UI Emoji"/>
+          <w:b/>
+          <w:bCs/>
+        </w:rPr>
+        <w:t>Hernandez</w:t>
+      </w:r>
+      <w:proofErr w:type="spellEnd"/>
+      <w:r>
+        <w:rPr>
+          <w:rFonts w:ascii="Segoe UI Emoji" w:hAnsi="Segoe UI Emoji" w:cs="Segoe UI Emoji"/>
+          <w:b/>
+          <w:bCs/>
+        </w:rPr>
+        <w:t xml:space="preserve"> Carlos </w:t>
+      </w:r>
+      <w:proofErr w:type="spellStart"/>
+      <w:r>
+        <w:rPr>
+          <w:rFonts w:ascii="Segoe UI Emoji" w:hAnsi="Segoe UI Emoji" w:cs="Segoe UI Emoji"/>
+          <w:b/>
+          <w:bCs/>
+        </w:rPr>
+        <w:t>Andres</w:t>
+      </w:r>
+      <w:proofErr w:type="spellEnd"/>
+    </w:p>
+    <w:p>
+      <w:pPr>
+        <w:rPr>
+          <w:rFonts w:ascii="Segoe UI Emoji" w:hAnsi="Segoe UI Emoji" w:cs="Segoe UI Emoji"/>
+          <w:b/>
+          <w:bCs/>
+        </w:rPr>
+      </w:pPr>
+    </w:p>
+    <w:p>
+      <w:pPr>
+        <w:rPr>
+          <w:rFonts w:ascii="Segoe UI Emoji" w:hAnsi="Segoe UI Emoji" w:cs="Segoe UI Emoji"/>
+        </w:rPr>
+      </w:pPr>
+      <w:proofErr w:type="gramStart"/>
       <w:r>
         <w:rPr>
           <w:rFonts w:ascii="Segoe UI Emoji" w:hAnsi="Segoe UI Emoji" w:cs="Segoe UI Emoji"/>
@@ -1874,7 +3179,11 @@
         <w:t>🎉</w:t>
       </w:r>
       <w:r>
-        <w:t xml:space="preserve">¡Felicitaciones por la entrega del Desafío 03! </w:t>
+        <w:t>¡</w:t>
+      </w:r>
+      <w:proofErr w:type="gramEnd"/>
+      <w:r>
+        <w:t xml:space="preserve">Felicitaciones por la entrega del Desafío 03! </w:t>
       </w:r>
       <w:r>
         <w:rPr>
@@ -1886,22 +3195,51 @@
     <w:p/>
     <w:p>
       <w:r>
-        <w:t>Carlos</w:t>
-      </w:r>
-      <w:r>
-        <w:t>, el trabajo realizado es excelente.</w:t>
-      </w:r>
-    </w:p>
-    <w:p/>
-    <w:p>
-      <w:r>
-        <w:t>La estructura HTML esta impecable, destaco la correcta implementación de contenedores semánticos como main, section, footer, etc. El manejo de listas, textos y títulos es correcto.</w:t>
-      </w:r>
-    </w:p>
-    <w:p/>
-    <w:p>
-      <w:r>
-        <w:t>La barra de navegación principal quedo ok, los links configurados con estado hover como se solicitó.</w:t>
+        <w:t>Carlos, el trabajo realizado es excelente.</w:t>
+      </w:r>
+    </w:p>
+    <w:p/>
+    <w:p>
+      <w:r>
+        <w:t xml:space="preserve">La estructura HTML esta impecable, destaco la correcta implementación de contenedores semánticos como </w:t>
+      </w:r>
+      <w:proofErr w:type="spellStart"/>
+      <w:r>
+        <w:t>main</w:t>
+      </w:r>
+      <w:proofErr w:type="spellEnd"/>
+      <w:r>
+        <w:t xml:space="preserve">, </w:t>
+      </w:r>
+      <w:proofErr w:type="spellStart"/>
+      <w:r>
+        <w:t>section</w:t>
+      </w:r>
+      <w:proofErr w:type="spellEnd"/>
+      <w:r>
+        <w:t xml:space="preserve">, </w:t>
+      </w:r>
+      <w:proofErr w:type="spellStart"/>
+      <w:r>
+        <w:t>footer</w:t>
+      </w:r>
+      <w:proofErr w:type="spellEnd"/>
+      <w:r>
+        <w:t>, etc. El manejo de listas, textos y títulos es correcto.</w:t>
+      </w:r>
+    </w:p>
+    <w:p/>
+    <w:p>
+      <w:r>
+        <w:t xml:space="preserve">La barra de navegación principal quedo ok, los links configurados con estado </w:t>
+      </w:r>
+      <w:proofErr w:type="spellStart"/>
+      <w:r>
+        <w:t>hover</w:t>
+      </w:r>
+      <w:proofErr w:type="spellEnd"/>
+      <w:r>
+        <w:t xml:space="preserve"> como se solicitó.</w:t>
       </w:r>
     </w:p>
     <w:p/>
@@ -1913,7 +3251,23 @@
     <w:p/>
     <w:p>
       <w:r>
-        <w:t>Los estilos solicitados tanto en colores, fuentes y dimensiones quedaron ok, también aplicaste correctamente las propiedades de box model. EL layout quedó responsivo como se solicitó en enunciado.</w:t>
+        <w:t xml:space="preserve">Los estilos solicitados tanto en colores, fuentes y dimensiones quedaron ok, también aplicaste correctamente las propiedades de box </w:t>
+      </w:r>
+      <w:proofErr w:type="spellStart"/>
+      <w:r>
+        <w:t>model</w:t>
+      </w:r>
+      <w:proofErr w:type="spellEnd"/>
+      <w:r>
+        <w:t xml:space="preserve">. EL </w:t>
+      </w:r>
+      <w:proofErr w:type="spellStart"/>
+      <w:r>
+        <w:t>layout</w:t>
+      </w:r>
+      <w:proofErr w:type="spellEnd"/>
+      <w:r>
+        <w:t xml:space="preserve"> quedó responsivo como se solicitó en enunciado.</w:t>
       </w:r>
     </w:p>
     <w:p/>
@@ -1937,8 +3291,39 @@
         </w:numPr>
       </w:pPr>
       <w:r>
-        <w:lastRenderedPageBreak/>
-        <w:t>Mejora la accesibilidad de tu formulario asociar la etiqueta &lt;label&gt; con el elemento &lt;input&gt; (a través del atributo for en el label y el id en el input ) :</w:t>
+        <w:t>Mejora la accesibilidad de tu formulario asociar la etiqueta &lt;</w:t>
+      </w:r>
+      <w:proofErr w:type="spellStart"/>
+      <w:r>
+        <w:t>label</w:t>
+      </w:r>
+      <w:proofErr w:type="spellEnd"/>
+      <w:r>
+        <w:t xml:space="preserve">&gt; con el elemento &lt;input&gt; (a través del atributo </w:t>
+      </w:r>
+      <w:proofErr w:type="spellStart"/>
+      <w:r>
+        <w:t>for</w:t>
+      </w:r>
+      <w:proofErr w:type="spellEnd"/>
+      <w:r>
+        <w:t xml:space="preserve"> en el </w:t>
+      </w:r>
+      <w:proofErr w:type="spellStart"/>
+      <w:r>
+        <w:t>label</w:t>
+      </w:r>
+      <w:proofErr w:type="spellEnd"/>
+      <w:r>
+        <w:t xml:space="preserve"> y el id en el </w:t>
+      </w:r>
+      <w:proofErr w:type="gramStart"/>
+      <w:r>
+        <w:t>input )</w:t>
+      </w:r>
+      <w:proofErr w:type="gramEnd"/>
+      <w:r>
+        <w:t xml:space="preserve"> :</w:t>
       </w:r>
     </w:p>
     <w:p>
@@ -1952,7 +3337,31 @@
         <w:ind w:left="1416"/>
       </w:pPr>
       <w:r>
-        <w:t>&lt;label for="email"&gt;Correo electrónico:&lt;/label&gt;</w:t>
+        <w:t>&lt;</w:t>
+      </w:r>
+      <w:proofErr w:type="spellStart"/>
+      <w:r>
+        <w:t>label</w:t>
+      </w:r>
+      <w:proofErr w:type="spellEnd"/>
+      <w:r>
+        <w:t xml:space="preserve"> </w:t>
+      </w:r>
+      <w:proofErr w:type="spellStart"/>
+      <w:r>
+        <w:t>for</w:t>
+      </w:r>
+      <w:proofErr w:type="spellEnd"/>
+      <w:r>
+        <w:t>="email"&gt;Correo electrónico:&lt;/</w:t>
+      </w:r>
+      <w:proofErr w:type="spellStart"/>
+      <w:r>
+        <w:t>label</w:t>
+      </w:r>
+      <w:proofErr w:type="spellEnd"/>
+      <w:r>
+        <w:t>&gt;</w:t>
       </w:r>
     </w:p>
     <w:p>
@@ -1996,7 +3405,39 @@
         </w:numPr>
       </w:pPr>
       <w:r>
-        <w:t>Al redimensionar la pantalla te quedaron pegados los bordes de los contenedores a los márgenes ahi te convendria mejor aplicar solo un padding de 10px de izquierda y derecha a la etiqueta &lt;main&gt; y sacarle el width:100%:</w:t>
+        <w:t xml:space="preserve">Al redimensionar la pantalla te quedaron pegados los bordes de los contenedores a los márgenes </w:t>
+      </w:r>
+      <w:proofErr w:type="spellStart"/>
+      <w:r>
+        <w:t>ahi</w:t>
+      </w:r>
+      <w:proofErr w:type="spellEnd"/>
+      <w:r>
+        <w:t xml:space="preserve"> te </w:t>
+      </w:r>
+      <w:proofErr w:type="spellStart"/>
+      <w:r>
+        <w:t>convendria</w:t>
+      </w:r>
+      <w:proofErr w:type="spellEnd"/>
+      <w:r>
+        <w:t xml:space="preserve"> mejor aplicar solo un </w:t>
+      </w:r>
+      <w:proofErr w:type="spellStart"/>
+      <w:r>
+        <w:t>padding</w:t>
+      </w:r>
+      <w:proofErr w:type="spellEnd"/>
+      <w:r>
+        <w:t xml:space="preserve"> de 10px de izquierda y derecha a la etiqueta &lt;</w:t>
+      </w:r>
+      <w:proofErr w:type="spellStart"/>
+      <w:r>
+        <w:t>main</w:t>
+      </w:r>
+      <w:proofErr w:type="spellEnd"/>
+      <w:r>
+        <w:t>&gt; y sacarle el width:100%:</w:t>
       </w:r>
     </w:p>
     <w:p>
@@ -2006,8 +3447,18 @@
     </w:p>
     <w:p>
       <w:r>
-        <w:t xml:space="preserve">                       main{</w:t>
-      </w:r>
+        <w:t xml:space="preserve">                       </w:t>
+      </w:r>
+      <w:proofErr w:type="spellStart"/>
+      <w:proofErr w:type="gramStart"/>
+      <w:r>
+        <w:t>main</w:t>
+      </w:r>
+      <w:proofErr w:type="spellEnd"/>
+      <w:r>
+        <w:t>{</w:t>
+      </w:r>
+      <w:proofErr w:type="gramEnd"/>
       <w:r>
         <w:tab/>
       </w:r>
@@ -2030,8 +3481,13 @@
       <w:pPr>
         <w:ind w:left="1416"/>
       </w:pPr>
-      <w:r>
-        <w:t xml:space="preserve">padding: 0 10px; </w:t>
+      <w:proofErr w:type="spellStart"/>
+      <w:r>
+        <w:t>padding</w:t>
+      </w:r>
+      <w:proofErr w:type="spellEnd"/>
+      <w:r>
+        <w:t xml:space="preserve">: 0 10px; </w:t>
       </w:r>
     </w:p>
     <w:p>
@@ -2118,6 +3574,7 @@
           <w:rFonts w:ascii="Segoe UI Emoji" w:hAnsi="Segoe UI Emoji" w:cs="Segoe UI Emoji"/>
         </w:rPr>
       </w:pPr>
+      <w:proofErr w:type="gramStart"/>
       <w:r>
         <w:rPr>
           <w:rFonts w:ascii="Segoe UI Emoji" w:hAnsi="Segoe UI Emoji" w:cs="Segoe UI Emoji"/>
@@ -2125,7 +3582,11 @@
         <w:t>🎉</w:t>
       </w:r>
       <w:r>
-        <w:t xml:space="preserve">¡Felicitaciones por la entrega del Desafío 01! </w:t>
+        <w:t>¡</w:t>
+      </w:r>
+      <w:proofErr w:type="gramEnd"/>
+      <w:r>
+        <w:t xml:space="preserve">Felicitaciones por la entrega del Desafío 01! </w:t>
       </w:r>
       <w:r>
         <w:rPr>
@@ -2143,6 +3604,7 @@
     <w:p/>
     <w:p>
       <w:r>
+        <w:lastRenderedPageBreak/>
         <w:t>Destaco la correcta estructura del documento HTML, genial que hayas declarado el lenguaje del documento en español, estos pequeños detalles van sumando a la legibilidad de la estructura.</w:t>
       </w:r>
     </w:p>
@@ -2155,7 +3617,23 @@
     <w:p/>
     <w:p>
       <w:r>
-        <w:t xml:space="preserve">Buenísimo que aplicaste etiquetas &lt;b&gt; para resaltar en negrita textos, te falto aplicar palabras claves con etiquetas &lt;strong&gt;, recorda que ayudan para que los motores de búsqueda entiendan mejor el contenido de tu documento web. </w:t>
+        <w:t>Buenísimo que aplicaste etiquetas &lt;b&gt; para resaltar en negrita textos, te falto aplicar palabras claves con etiquetas &lt;</w:t>
+      </w:r>
+      <w:proofErr w:type="spellStart"/>
+      <w:r>
+        <w:t>strong</w:t>
+      </w:r>
+      <w:proofErr w:type="spellEnd"/>
+      <w:r>
+        <w:t xml:space="preserve">&gt;, </w:t>
+      </w:r>
+      <w:proofErr w:type="spellStart"/>
+      <w:r>
+        <w:t>recorda</w:t>
+      </w:r>
+      <w:proofErr w:type="spellEnd"/>
+      <w:r>
+        <w:t xml:space="preserve"> que ayudan para que los motores de búsqueda entiendan mejor el contenido de tu documento web. </w:t>
       </w:r>
     </w:p>
     <w:p/>
@@ -2201,33 +3679,52 @@
           <w:b/>
           <w:bCs/>
         </w:rPr>
-        <w:t>Cabrera Kowalsky Sofia Abril</w:t>
-      </w:r>
-    </w:p>
-    <w:p>
-      <w:pPr>
-        <w:rPr>
-          <w:rFonts w:ascii="Segoe UI Emoji" w:hAnsi="Segoe UI Emoji" w:cs="Segoe UI Emoji"/>
-          <w:b/>
-          <w:bCs/>
-        </w:rPr>
-      </w:pPr>
-    </w:p>
-    <w:p>
-      <w:pPr>
-        <w:rPr>
-          <w:rFonts w:ascii="Segoe UI Emoji" w:hAnsi="Segoe UI Emoji" w:cs="Segoe UI Emoji"/>
-          <w:b/>
-          <w:bCs/>
-        </w:rPr>
-      </w:pPr>
-    </w:p>
-    <w:p>
-      <w:pPr>
-        <w:rPr>
-          <w:rFonts w:ascii="Segoe UI Emoji" w:hAnsi="Segoe UI Emoji" w:cs="Segoe UI Emoji"/>
-        </w:rPr>
-      </w:pPr>
+        <w:t xml:space="preserve">Cabrera </w:t>
+      </w:r>
+      <w:proofErr w:type="spellStart"/>
+      <w:r>
+        <w:rPr>
+          <w:rFonts w:ascii="Segoe UI Emoji" w:hAnsi="Segoe UI Emoji" w:cs="Segoe UI Emoji"/>
+          <w:b/>
+          <w:bCs/>
+        </w:rPr>
+        <w:t>Kowalsky</w:t>
+      </w:r>
+      <w:proofErr w:type="spellEnd"/>
+      <w:r>
+        <w:rPr>
+          <w:rFonts w:ascii="Segoe UI Emoji" w:hAnsi="Segoe UI Emoji" w:cs="Segoe UI Emoji"/>
+          <w:b/>
+          <w:bCs/>
+        </w:rPr>
+        <w:t xml:space="preserve"> Sofia Abril</w:t>
+      </w:r>
+    </w:p>
+    <w:p>
+      <w:pPr>
+        <w:rPr>
+          <w:rFonts w:ascii="Segoe UI Emoji" w:hAnsi="Segoe UI Emoji" w:cs="Segoe UI Emoji"/>
+          <w:b/>
+          <w:bCs/>
+        </w:rPr>
+      </w:pPr>
+    </w:p>
+    <w:p>
+      <w:pPr>
+        <w:rPr>
+          <w:rFonts w:ascii="Segoe UI Emoji" w:hAnsi="Segoe UI Emoji" w:cs="Segoe UI Emoji"/>
+          <w:b/>
+          <w:bCs/>
+        </w:rPr>
+      </w:pPr>
+    </w:p>
+    <w:p>
+      <w:pPr>
+        <w:rPr>
+          <w:rFonts w:ascii="Segoe UI Emoji" w:hAnsi="Segoe UI Emoji" w:cs="Segoe UI Emoji"/>
+        </w:rPr>
+      </w:pPr>
+      <w:proofErr w:type="gramStart"/>
       <w:r>
         <w:rPr>
           <w:rFonts w:ascii="Segoe UI Emoji" w:hAnsi="Segoe UI Emoji" w:cs="Segoe UI Emoji"/>
@@ -2235,7 +3732,11 @@
         <w:t>🎉</w:t>
       </w:r>
       <w:r>
-        <w:t xml:space="preserve">¡Felicitaciones por la entrega del Desafío 03! </w:t>
+        <w:t>¡</w:t>
+      </w:r>
+      <w:proofErr w:type="gramEnd"/>
+      <w:r>
+        <w:t xml:space="preserve">Felicitaciones por la entrega del Desafío 03! </w:t>
       </w:r>
       <w:r>
         <w:rPr>
@@ -2247,28 +3748,51 @@
     <w:p/>
     <w:p>
       <w:r>
-        <w:t>Sofia</w:t>
-      </w:r>
-      <w:r>
-        <w:t xml:space="preserve">, el </w:t>
-      </w:r>
-      <w:r>
-        <w:t>resultado logrado es muy bueno, te felicito.</w:t>
-      </w:r>
-      <w:r>
-        <w:t xml:space="preserve"> </w:t>
-      </w:r>
-    </w:p>
-    <w:p/>
-    <w:p>
-      <w:r>
-        <w:t>La estructura HTML esta impecable, destaco la correcta implementación de contenedores semánticos como main, section, footer, etc. El manejo de listas, textos y títulos es correcto.</w:t>
-      </w:r>
-    </w:p>
-    <w:p/>
-    <w:p>
-      <w:r>
-        <w:t>La barra de navegación principal quedo ok, los enlaces configurados con estado hover como se solicitó.</w:t>
+        <w:t xml:space="preserve">Sofia, el resultado logrado es muy bueno, te felicito. </w:t>
+      </w:r>
+    </w:p>
+    <w:p/>
+    <w:p>
+      <w:r>
+        <w:t xml:space="preserve">La estructura HTML esta impecable, destaco la correcta implementación de contenedores semánticos como </w:t>
+      </w:r>
+      <w:proofErr w:type="spellStart"/>
+      <w:r>
+        <w:t>main</w:t>
+      </w:r>
+      <w:proofErr w:type="spellEnd"/>
+      <w:r>
+        <w:t xml:space="preserve">, </w:t>
+      </w:r>
+      <w:proofErr w:type="spellStart"/>
+      <w:r>
+        <w:t>section</w:t>
+      </w:r>
+      <w:proofErr w:type="spellEnd"/>
+      <w:r>
+        <w:t xml:space="preserve">, </w:t>
+      </w:r>
+      <w:proofErr w:type="spellStart"/>
+      <w:r>
+        <w:t>footer</w:t>
+      </w:r>
+      <w:proofErr w:type="spellEnd"/>
+      <w:r>
+        <w:t>, etc. El manejo de listas, textos y títulos es correcto.</w:t>
+      </w:r>
+    </w:p>
+    <w:p/>
+    <w:p>
+      <w:r>
+        <w:t xml:space="preserve">La barra de navegación principal quedo ok, los enlaces configurados con estado </w:t>
+      </w:r>
+      <w:proofErr w:type="spellStart"/>
+      <w:r>
+        <w:t>hover</w:t>
+      </w:r>
+      <w:proofErr w:type="spellEnd"/>
+      <w:r>
+        <w:t xml:space="preserve"> como se solicitó.</w:t>
       </w:r>
     </w:p>
     <w:p/>
@@ -2280,7 +3804,24 @@
     <w:p/>
     <w:p>
       <w:r>
-        <w:t>Los estilos solicitados tanto en colores, fuentes y dimensiones quedaron ok, también aplicaste correctamente las propiedades de box model. EL layout quedó responsivo como se solicitó en enunciado.</w:t>
+        <w:lastRenderedPageBreak/>
+        <w:t xml:space="preserve">Los estilos solicitados tanto en colores, fuentes y dimensiones quedaron ok, también aplicaste correctamente las propiedades de box </w:t>
+      </w:r>
+      <w:proofErr w:type="spellStart"/>
+      <w:r>
+        <w:t>model</w:t>
+      </w:r>
+      <w:proofErr w:type="spellEnd"/>
+      <w:r>
+        <w:t xml:space="preserve">. EL </w:t>
+      </w:r>
+      <w:proofErr w:type="spellStart"/>
+      <w:r>
+        <w:t>layout</w:t>
+      </w:r>
+      <w:proofErr w:type="spellEnd"/>
+      <w:r>
+        <w:t xml:space="preserve"> quedó responsivo como se solicitó en enunciado.</w:t>
       </w:r>
     </w:p>
     <w:p/>
@@ -2299,32 +3840,39 @@
         </w:numPr>
       </w:pPr>
       <w:r>
-        <w:lastRenderedPageBreak/>
-        <w:t xml:space="preserve">Al redimensionar la pantalla </w:t>
-      </w:r>
-      <w:r>
-        <w:t>te quedaron pegados los bordes de los contenedores a los márgenes ahi</w:t>
-      </w:r>
-      <w:r>
-        <w:t xml:space="preserve"> te conven</w:t>
-      </w:r>
-      <w:r>
-        <w:t>dria</w:t>
-      </w:r>
-      <w:r>
-        <w:t xml:space="preserve"> mejor aplicar solo un padding de 10px de izquierda y derecha a la etiqueta &lt;main&gt; y sacar</w:t>
-      </w:r>
-      <w:r>
-        <w:t>le</w:t>
-      </w:r>
-      <w:r>
-        <w:t xml:space="preserve"> el width:</w:t>
-      </w:r>
-      <w:r>
-        <w:t>100</w:t>
-      </w:r>
-      <w:r>
-        <w:t>%:</w:t>
+        <w:t xml:space="preserve">Al redimensionar la pantalla te quedaron pegados los bordes de los contenedores a los márgenes </w:t>
+      </w:r>
+      <w:proofErr w:type="spellStart"/>
+      <w:r>
+        <w:t>ahi</w:t>
+      </w:r>
+      <w:proofErr w:type="spellEnd"/>
+      <w:r>
+        <w:t xml:space="preserve"> te </w:t>
+      </w:r>
+      <w:proofErr w:type="spellStart"/>
+      <w:r>
+        <w:t>convendria</w:t>
+      </w:r>
+      <w:proofErr w:type="spellEnd"/>
+      <w:r>
+        <w:t xml:space="preserve"> mejor aplicar solo un </w:t>
+      </w:r>
+      <w:proofErr w:type="spellStart"/>
+      <w:r>
+        <w:t>padding</w:t>
+      </w:r>
+      <w:proofErr w:type="spellEnd"/>
+      <w:r>
+        <w:t xml:space="preserve"> de 10px de izquierda y derecha a la etiqueta &lt;</w:t>
+      </w:r>
+      <w:proofErr w:type="spellStart"/>
+      <w:r>
+        <w:t>main</w:t>
+      </w:r>
+      <w:proofErr w:type="spellEnd"/>
+      <w:r>
+        <w:t>&gt; y sacarle el width:100%:</w:t>
       </w:r>
     </w:p>
     <w:p>
@@ -2334,8 +3882,18 @@
     </w:p>
     <w:p>
       <w:r>
-        <w:t xml:space="preserve">                       main{</w:t>
-      </w:r>
+        <w:t xml:space="preserve">                       </w:t>
+      </w:r>
+      <w:proofErr w:type="spellStart"/>
+      <w:proofErr w:type="gramStart"/>
+      <w:r>
+        <w:t>main</w:t>
+      </w:r>
+      <w:proofErr w:type="spellEnd"/>
+      <w:r>
+        <w:t>{</w:t>
+      </w:r>
+      <w:proofErr w:type="gramEnd"/>
       <w:r>
         <w:tab/>
       </w:r>
@@ -2358,8 +3916,13 @@
       <w:pPr>
         <w:ind w:left="1416"/>
       </w:pPr>
-      <w:r>
-        <w:t xml:space="preserve">padding: 0 10px; </w:t>
+      <w:proofErr w:type="spellStart"/>
+      <w:r>
+        <w:t>padding</w:t>
+      </w:r>
+      <w:proofErr w:type="spellEnd"/>
+      <w:r>
+        <w:t xml:space="preserve">: 0 10px; </w:t>
       </w:r>
     </w:p>
     <w:p>
@@ -2425,30 +3988,41 @@
           <w:bCs/>
         </w:rPr>
       </w:pPr>
-      <w:r>
-        <w:rPr>
-          <w:rFonts w:ascii="Segoe UI Emoji" w:hAnsi="Segoe UI Emoji" w:cs="Segoe UI Emoji"/>
-          <w:b/>
-          <w:bCs/>
-        </w:rPr>
-        <w:t>Imas Guerrero Catalina Eva</w:t>
-      </w:r>
-    </w:p>
-    <w:p>
-      <w:pPr>
-        <w:rPr>
-          <w:rFonts w:ascii="Segoe UI Emoji" w:hAnsi="Segoe UI Emoji" w:cs="Segoe UI Emoji"/>
-          <w:b/>
-          <w:bCs/>
-        </w:rPr>
-      </w:pPr>
-    </w:p>
-    <w:p>
-      <w:pPr>
-        <w:rPr>
-          <w:rFonts w:ascii="Segoe UI Emoji" w:hAnsi="Segoe UI Emoji" w:cs="Segoe UI Emoji"/>
-        </w:rPr>
-      </w:pPr>
+      <w:proofErr w:type="spellStart"/>
+      <w:r>
+        <w:rPr>
+          <w:rFonts w:ascii="Segoe UI Emoji" w:hAnsi="Segoe UI Emoji" w:cs="Segoe UI Emoji"/>
+          <w:b/>
+          <w:bCs/>
+        </w:rPr>
+        <w:t>Imas</w:t>
+      </w:r>
+      <w:proofErr w:type="spellEnd"/>
+      <w:r>
+        <w:rPr>
+          <w:rFonts w:ascii="Segoe UI Emoji" w:hAnsi="Segoe UI Emoji" w:cs="Segoe UI Emoji"/>
+          <w:b/>
+          <w:bCs/>
+        </w:rPr>
+        <w:t xml:space="preserve"> Guerrero Catalina Eva</w:t>
+      </w:r>
+    </w:p>
+    <w:p>
+      <w:pPr>
+        <w:rPr>
+          <w:rFonts w:ascii="Segoe UI Emoji" w:hAnsi="Segoe UI Emoji" w:cs="Segoe UI Emoji"/>
+          <w:b/>
+          <w:bCs/>
+        </w:rPr>
+      </w:pPr>
+    </w:p>
+    <w:p>
+      <w:pPr>
+        <w:rPr>
+          <w:rFonts w:ascii="Segoe UI Emoji" w:hAnsi="Segoe UI Emoji" w:cs="Segoe UI Emoji"/>
+        </w:rPr>
+      </w:pPr>
+      <w:proofErr w:type="gramStart"/>
       <w:r>
         <w:rPr>
           <w:rFonts w:ascii="Segoe UI Emoji" w:hAnsi="Segoe UI Emoji" w:cs="Segoe UI Emoji"/>
@@ -2456,7 +4030,11 @@
         <w:t>🎉</w:t>
       </w:r>
       <w:r>
-        <w:t xml:space="preserve">¡Felicitaciones por la entrega del Desafío 03! </w:t>
+        <w:t>¡</w:t>
+      </w:r>
+      <w:proofErr w:type="gramEnd"/>
+      <w:r>
+        <w:t xml:space="preserve">Felicitaciones por la entrega del Desafío 03! </w:t>
       </w:r>
       <w:r>
         <w:rPr>
@@ -2474,13 +4052,45 @@
     <w:p/>
     <w:p>
       <w:r>
-        <w:t>La estructura HTML esta impecable, destaco la correcta implementación de contenedores semánticos como main, section, footer, etc. El manejo de listas, textos y títulos es correcto.</w:t>
-      </w:r>
-    </w:p>
-    <w:p/>
-    <w:p>
-      <w:r>
-        <w:t>La barra de navegación principal quedo ok, los links configurados con estado hover como se solicitó.</w:t>
+        <w:t xml:space="preserve">La estructura HTML esta impecable, destaco la correcta implementación de contenedores semánticos como </w:t>
+      </w:r>
+      <w:proofErr w:type="spellStart"/>
+      <w:r>
+        <w:t>main</w:t>
+      </w:r>
+      <w:proofErr w:type="spellEnd"/>
+      <w:r>
+        <w:t xml:space="preserve">, </w:t>
+      </w:r>
+      <w:proofErr w:type="spellStart"/>
+      <w:r>
+        <w:t>section</w:t>
+      </w:r>
+      <w:proofErr w:type="spellEnd"/>
+      <w:r>
+        <w:t xml:space="preserve">, </w:t>
+      </w:r>
+      <w:proofErr w:type="spellStart"/>
+      <w:r>
+        <w:t>footer</w:t>
+      </w:r>
+      <w:proofErr w:type="spellEnd"/>
+      <w:r>
+        <w:t>, etc. El manejo de listas, textos y títulos es correcto.</w:t>
+      </w:r>
+    </w:p>
+    <w:p/>
+    <w:p>
+      <w:r>
+        <w:t xml:space="preserve">La barra de navegación principal quedo ok, los links configurados con estado </w:t>
+      </w:r>
+      <w:proofErr w:type="spellStart"/>
+      <w:r>
+        <w:t>hover</w:t>
+      </w:r>
+      <w:proofErr w:type="spellEnd"/>
+      <w:r>
+        <w:t xml:space="preserve"> como se solicitó.</w:t>
       </w:r>
     </w:p>
     <w:p/>
@@ -2492,14 +4102,29 @@
     <w:p/>
     <w:p>
       <w:r>
-        <w:t>Los estilos solicitados tanto en colores, fuentes y dimensiones quedaron ok, también aplicaste correctamente las propiedades de box model. EL layout quedó responsivo como se solicitó en enunciado.</w:t>
-      </w:r>
-    </w:p>
-    <w:p/>
-    <w:p/>
-    <w:p>
-      <w:r>
-        <w:lastRenderedPageBreak/>
+        <w:t xml:space="preserve">Los estilos solicitados tanto en colores, fuentes y dimensiones quedaron ok, también aplicaste correctamente las propiedades de box </w:t>
+      </w:r>
+      <w:proofErr w:type="spellStart"/>
+      <w:r>
+        <w:t>model</w:t>
+      </w:r>
+      <w:proofErr w:type="spellEnd"/>
+      <w:r>
+        <w:t xml:space="preserve">. EL </w:t>
+      </w:r>
+      <w:proofErr w:type="spellStart"/>
+      <w:r>
+        <w:t>layout</w:t>
+      </w:r>
+      <w:proofErr w:type="spellEnd"/>
+      <w:r>
+        <w:t xml:space="preserve"> quedó responsivo como se solicitó en enunciado.</w:t>
+      </w:r>
+    </w:p>
+    <w:p/>
+    <w:p/>
+    <w:p>
+      <w:r>
         <w:t xml:space="preserve">Tu nota en el Desafío 03 es: </w:t>
       </w:r>
       <w:r>
@@ -2551,6 +4176,7 @@
           <w:rFonts w:ascii="Segoe UI Emoji" w:hAnsi="Segoe UI Emoji" w:cs="Segoe UI Emoji"/>
         </w:rPr>
       </w:pPr>
+      <w:proofErr w:type="gramStart"/>
       <w:r>
         <w:rPr>
           <w:rFonts w:ascii="Segoe UI Emoji" w:hAnsi="Segoe UI Emoji" w:cs="Segoe UI Emoji"/>
@@ -2558,7 +4184,11 @@
         <w:t>🎉</w:t>
       </w:r>
       <w:r>
-        <w:t xml:space="preserve">¡Felicitaciones por la entrega del Desafío 03! </w:t>
+        <w:t>¡</w:t>
+      </w:r>
+      <w:proofErr w:type="gramEnd"/>
+      <w:r>
+        <w:t xml:space="preserve">Felicitaciones por la entrega del Desafío 03! </w:t>
       </w:r>
       <w:r>
         <w:rPr>
@@ -2576,13 +4206,45 @@
     <w:p/>
     <w:p>
       <w:r>
-        <w:t>La estructura HTML esta impecable, destaco la correcta implementación de contenedores semánticos como main, section, footer, etc. El manejo de listas, textos y títulos es correcto.</w:t>
-      </w:r>
-    </w:p>
-    <w:p/>
-    <w:p>
-      <w:r>
-        <w:t>La barra de navegación principal quedo ok, los links configurados con estado hover como se solicitó.</w:t>
+        <w:t xml:space="preserve">La estructura HTML esta impecable, destaco la correcta implementación de contenedores semánticos como </w:t>
+      </w:r>
+      <w:proofErr w:type="spellStart"/>
+      <w:r>
+        <w:t>main</w:t>
+      </w:r>
+      <w:proofErr w:type="spellEnd"/>
+      <w:r>
+        <w:t xml:space="preserve">, </w:t>
+      </w:r>
+      <w:proofErr w:type="spellStart"/>
+      <w:r>
+        <w:t>section</w:t>
+      </w:r>
+      <w:proofErr w:type="spellEnd"/>
+      <w:r>
+        <w:t xml:space="preserve">, </w:t>
+      </w:r>
+      <w:proofErr w:type="spellStart"/>
+      <w:r>
+        <w:t>footer</w:t>
+      </w:r>
+      <w:proofErr w:type="spellEnd"/>
+      <w:r>
+        <w:t>, etc. El manejo de listas, textos y títulos es correcto.</w:t>
+      </w:r>
+    </w:p>
+    <w:p/>
+    <w:p>
+      <w:r>
+        <w:t xml:space="preserve">La barra de navegación principal quedo ok, los links configurados con estado </w:t>
+      </w:r>
+      <w:proofErr w:type="spellStart"/>
+      <w:r>
+        <w:t>hover</w:t>
+      </w:r>
+      <w:proofErr w:type="spellEnd"/>
+      <w:r>
+        <w:t xml:space="preserve"> como se solicitó.</w:t>
       </w:r>
     </w:p>
     <w:p/>
@@ -2594,7 +4256,23 @@
     <w:p/>
     <w:p>
       <w:r>
-        <w:t>Los estilos solicitados tanto en colores, fuentes y dimensiones quedaron ok, también aplicaste correctamente las propiedades de box model. EL layout quedó responsivo como se solicitó en enunciado.</w:t>
+        <w:t xml:space="preserve">Los estilos solicitados tanto en colores, fuentes y dimensiones quedaron ok, también aplicaste correctamente las propiedades de box </w:t>
+      </w:r>
+      <w:proofErr w:type="spellStart"/>
+      <w:r>
+        <w:t>model</w:t>
+      </w:r>
+      <w:proofErr w:type="spellEnd"/>
+      <w:r>
+        <w:t xml:space="preserve">. EL </w:t>
+      </w:r>
+      <w:proofErr w:type="spellStart"/>
+      <w:r>
+        <w:t>layout</w:t>
+      </w:r>
+      <w:proofErr w:type="spellEnd"/>
+      <w:r>
+        <w:t xml:space="preserve"> quedó responsivo como se solicitó en enunciado.</w:t>
       </w:r>
     </w:p>
     <w:p/>
@@ -2634,6 +4312,7 @@
           <w:b/>
           <w:bCs/>
         </w:rPr>
+        <w:lastRenderedPageBreak/>
         <w:t>Zabala Pons Gonzalo</w:t>
       </w:r>
     </w:p>
@@ -2652,6 +4331,7 @@
           <w:rFonts w:ascii="Segoe UI Emoji" w:hAnsi="Segoe UI Emoji" w:cs="Segoe UI Emoji"/>
         </w:rPr>
       </w:pPr>
+      <w:proofErr w:type="gramStart"/>
       <w:r>
         <w:rPr>
           <w:rFonts w:ascii="Segoe UI Emoji" w:hAnsi="Segoe UI Emoji" w:cs="Segoe UI Emoji"/>
@@ -2659,7 +4339,11 @@
         <w:t>🎉</w:t>
       </w:r>
       <w:r>
-        <w:t xml:space="preserve">¡Felicitaciones por la entrega del Desafío 03! </w:t>
+        <w:t>¡</w:t>
+      </w:r>
+      <w:proofErr w:type="gramEnd"/>
+      <w:r>
+        <w:t xml:space="preserve">Felicitaciones por la entrega del Desafío 03! </w:t>
       </w:r>
       <w:r>
         <w:rPr>
@@ -2671,22 +4355,51 @@
     <w:p/>
     <w:p>
       <w:r>
-        <w:t>Gonzalo</w:t>
-      </w:r>
-      <w:r>
-        <w:t>, el trabajo realizado es excelente. Destaco la prolijidad del documento ¡</w:t>
-      </w:r>
-    </w:p>
-    <w:p/>
-    <w:p>
-      <w:r>
-        <w:t>La estructura HTML esta impecable, destaco la correcta implementación de contenedores semánticos como main, section, footer, etc. El manejo de listas, textos y títulos es correcto.</w:t>
-      </w:r>
-    </w:p>
-    <w:p/>
-    <w:p>
-      <w:r>
-        <w:t>La barra de navegación principal quedo ok, los links configurados con estado hover como se solicitó.</w:t>
+        <w:t>Gonzalo, el trabajo realizado es excelente. Destaco la prolijidad del documento ¡</w:t>
+      </w:r>
+    </w:p>
+    <w:p/>
+    <w:p>
+      <w:r>
+        <w:t xml:space="preserve">La estructura HTML esta impecable, destaco la correcta implementación de contenedores semánticos como </w:t>
+      </w:r>
+      <w:proofErr w:type="spellStart"/>
+      <w:r>
+        <w:t>main</w:t>
+      </w:r>
+      <w:proofErr w:type="spellEnd"/>
+      <w:r>
+        <w:t xml:space="preserve">, </w:t>
+      </w:r>
+      <w:proofErr w:type="spellStart"/>
+      <w:r>
+        <w:t>section</w:t>
+      </w:r>
+      <w:proofErr w:type="spellEnd"/>
+      <w:r>
+        <w:t xml:space="preserve">, </w:t>
+      </w:r>
+      <w:proofErr w:type="spellStart"/>
+      <w:r>
+        <w:t>footer</w:t>
+      </w:r>
+      <w:proofErr w:type="spellEnd"/>
+      <w:r>
+        <w:t>, etc. El manejo de listas, textos y títulos es correcto.</w:t>
+      </w:r>
+    </w:p>
+    <w:p/>
+    <w:p>
+      <w:r>
+        <w:t xml:space="preserve">La barra de navegación principal quedo ok, los links configurados con estado </w:t>
+      </w:r>
+      <w:proofErr w:type="spellStart"/>
+      <w:r>
+        <w:t>hover</w:t>
+      </w:r>
+      <w:proofErr w:type="spellEnd"/>
+      <w:r>
+        <w:t xml:space="preserve"> como se solicitó.</w:t>
       </w:r>
     </w:p>
     <w:p/>
@@ -2698,7 +4411,23 @@
     <w:p/>
     <w:p>
       <w:r>
-        <w:t>Los estilos solicitados tanto en colores, fuentes y dimensiones quedaron ok, también aplicaste correctamente las propiedades de box model. EL layout quedó responsivo como se solicitó en enunciado.</w:t>
+        <w:t xml:space="preserve">Los estilos solicitados tanto en colores, fuentes y dimensiones quedaron ok, también aplicaste correctamente las propiedades de box </w:t>
+      </w:r>
+      <w:proofErr w:type="spellStart"/>
+      <w:r>
+        <w:t>model</w:t>
+      </w:r>
+      <w:proofErr w:type="spellEnd"/>
+      <w:r>
+        <w:t xml:space="preserve">. EL </w:t>
+      </w:r>
+      <w:proofErr w:type="spellStart"/>
+      <w:r>
+        <w:t>layout</w:t>
+      </w:r>
+      <w:proofErr w:type="spellEnd"/>
+      <w:r>
+        <w:t xml:space="preserve"> quedó responsivo como se solicitó en enunciado.</w:t>
       </w:r>
     </w:p>
     <w:p/>
@@ -2738,30 +4467,59 @@
           <w:bCs/>
         </w:rPr>
       </w:pPr>
-      <w:r>
-        <w:rPr>
-          <w:rFonts w:ascii="Segoe UI Emoji" w:hAnsi="Segoe UI Emoji" w:cs="Segoe UI Emoji"/>
-          <w:b/>
-          <w:bCs/>
-        </w:rPr>
-        <w:t>Pousadas Bernardis Juan Manuel</w:t>
-      </w:r>
-    </w:p>
-    <w:p>
-      <w:pPr>
-        <w:rPr>
-          <w:rFonts w:ascii="Segoe UI Emoji" w:hAnsi="Segoe UI Emoji" w:cs="Segoe UI Emoji"/>
-          <w:b/>
-          <w:bCs/>
-        </w:rPr>
-      </w:pPr>
-    </w:p>
-    <w:p>
-      <w:pPr>
-        <w:rPr>
-          <w:rFonts w:ascii="Segoe UI Emoji" w:hAnsi="Segoe UI Emoji" w:cs="Segoe UI Emoji"/>
-        </w:rPr>
-      </w:pPr>
+      <w:proofErr w:type="spellStart"/>
+      <w:r>
+        <w:rPr>
+          <w:rFonts w:ascii="Segoe UI Emoji" w:hAnsi="Segoe UI Emoji" w:cs="Segoe UI Emoji"/>
+          <w:b/>
+          <w:bCs/>
+        </w:rPr>
+        <w:t>Pousadas</w:t>
+      </w:r>
+      <w:proofErr w:type="spellEnd"/>
+      <w:r>
+        <w:rPr>
+          <w:rFonts w:ascii="Segoe UI Emoji" w:hAnsi="Segoe UI Emoji" w:cs="Segoe UI Emoji"/>
+          <w:b/>
+          <w:bCs/>
+        </w:rPr>
+        <w:t xml:space="preserve"> </w:t>
+      </w:r>
+      <w:proofErr w:type="spellStart"/>
+      <w:r>
+        <w:rPr>
+          <w:rFonts w:ascii="Segoe UI Emoji" w:hAnsi="Segoe UI Emoji" w:cs="Segoe UI Emoji"/>
+          <w:b/>
+          <w:bCs/>
+        </w:rPr>
+        <w:t>Bernardis</w:t>
+      </w:r>
+      <w:proofErr w:type="spellEnd"/>
+      <w:r>
+        <w:rPr>
+          <w:rFonts w:ascii="Segoe UI Emoji" w:hAnsi="Segoe UI Emoji" w:cs="Segoe UI Emoji"/>
+          <w:b/>
+          <w:bCs/>
+        </w:rPr>
+        <w:t xml:space="preserve"> Juan Manuel</w:t>
+      </w:r>
+    </w:p>
+    <w:p>
+      <w:pPr>
+        <w:rPr>
+          <w:rFonts w:ascii="Segoe UI Emoji" w:hAnsi="Segoe UI Emoji" w:cs="Segoe UI Emoji"/>
+          <w:b/>
+          <w:bCs/>
+        </w:rPr>
+      </w:pPr>
+    </w:p>
+    <w:p>
+      <w:pPr>
+        <w:rPr>
+          <w:rFonts w:ascii="Segoe UI Emoji" w:hAnsi="Segoe UI Emoji" w:cs="Segoe UI Emoji"/>
+        </w:rPr>
+      </w:pPr>
+      <w:proofErr w:type="gramStart"/>
       <w:r>
         <w:rPr>
           <w:rFonts w:ascii="Segoe UI Emoji" w:hAnsi="Segoe UI Emoji" w:cs="Segoe UI Emoji"/>
@@ -2769,7 +4527,11 @@
         <w:t>🎉</w:t>
       </w:r>
       <w:r>
-        <w:t xml:space="preserve">¡Felicitaciones por la entrega del Desafío 03! </w:t>
+        <w:t>¡</w:t>
+      </w:r>
+      <w:proofErr w:type="gramEnd"/>
+      <w:r>
+        <w:t xml:space="preserve">Felicitaciones por la entrega del Desafío 03! </w:t>
       </w:r>
       <w:r>
         <w:rPr>
@@ -2787,13 +4549,46 @@
     <w:p/>
     <w:p>
       <w:r>
-        <w:t>La estructura HTML esta impecable, destaco la correcta implementación de contenedores semánticos como main, section, footer, etc. El manejo de listas, textos y títulos es correcto.</w:t>
-      </w:r>
-    </w:p>
-    <w:p/>
-    <w:p>
-      <w:r>
-        <w:t>La barra de navegación principal quedo ok, los links configurados con estado hover como se solicitó.</w:t>
+        <w:t xml:space="preserve">La estructura HTML esta impecable, destaco la correcta implementación de contenedores semánticos como </w:t>
+      </w:r>
+      <w:proofErr w:type="spellStart"/>
+      <w:r>
+        <w:t>main</w:t>
+      </w:r>
+      <w:proofErr w:type="spellEnd"/>
+      <w:r>
+        <w:t xml:space="preserve">, </w:t>
+      </w:r>
+      <w:proofErr w:type="spellStart"/>
+      <w:r>
+        <w:t>section</w:t>
+      </w:r>
+      <w:proofErr w:type="spellEnd"/>
+      <w:r>
+        <w:t xml:space="preserve">, </w:t>
+      </w:r>
+      <w:proofErr w:type="spellStart"/>
+      <w:r>
+        <w:t>footer</w:t>
+      </w:r>
+      <w:proofErr w:type="spellEnd"/>
+      <w:r>
+        <w:t>, etc. El manejo de listas, textos y títulos es correcto.</w:t>
+      </w:r>
+    </w:p>
+    <w:p/>
+    <w:p>
+      <w:r>
+        <w:lastRenderedPageBreak/>
+        <w:t xml:space="preserve">La barra de navegación principal quedo ok, los links configurados con estado </w:t>
+      </w:r>
+      <w:proofErr w:type="spellStart"/>
+      <w:r>
+        <w:t>hover</w:t>
+      </w:r>
+      <w:proofErr w:type="spellEnd"/>
+      <w:r>
+        <w:t xml:space="preserve"> como se solicitó.</w:t>
       </w:r>
     </w:p>
     <w:p/>
@@ -2805,8 +4600,23 @@
     <w:p/>
     <w:p>
       <w:r>
-        <w:lastRenderedPageBreak/>
-        <w:t>Los estilos solicitados tanto en colores, fuentes y dimensiones quedaron ok, también aplicaste correctamente las propiedades de box model. EL layout quedó responsivo como se solicitó en enunciado.</w:t>
+        <w:t xml:space="preserve">Los estilos solicitados tanto en colores, fuentes y dimensiones quedaron ok, también aplicaste correctamente las propiedades de box </w:t>
+      </w:r>
+      <w:proofErr w:type="spellStart"/>
+      <w:r>
+        <w:t>model</w:t>
+      </w:r>
+      <w:proofErr w:type="spellEnd"/>
+      <w:r>
+        <w:t xml:space="preserve">. EL </w:t>
+      </w:r>
+      <w:proofErr w:type="spellStart"/>
+      <w:r>
+        <w:t>layout</w:t>
+      </w:r>
+      <w:proofErr w:type="spellEnd"/>
+      <w:r>
+        <w:t xml:space="preserve"> quedó responsivo como se solicitó en enunciado.</w:t>
       </w:r>
     </w:p>
     <w:p/>
@@ -2825,8 +4635,37 @@
           <w:numId w:val="1"/>
         </w:numPr>
       </w:pPr>
-      <w:r>
-        <w:t>Recordá cambiar el lenguaje a español &lt;html lang="es"&gt; porque esto le dice a los motores de búsqueda en que idioma esta tu sitio web.</w:t>
+      <w:proofErr w:type="spellStart"/>
+      <w:r>
+        <w:t>Recordá</w:t>
+      </w:r>
+      <w:proofErr w:type="spellEnd"/>
+      <w:r>
+        <w:t xml:space="preserve"> cambiar el lenguaje a español &lt;</w:t>
+      </w:r>
+      <w:proofErr w:type="spellStart"/>
+      <w:r>
+        <w:t>html</w:t>
+      </w:r>
+      <w:proofErr w:type="spellEnd"/>
+      <w:r>
+        <w:t xml:space="preserve"> </w:t>
+      </w:r>
+      <w:proofErr w:type="spellStart"/>
+      <w:r>
+        <w:t>lang</w:t>
+      </w:r>
+      <w:proofErr w:type="spellEnd"/>
+      <w:r>
+        <w:t xml:space="preserve">="es"&gt; porque esto </w:t>
+      </w:r>
+      <w:proofErr w:type="gramStart"/>
+      <w:r>
+        <w:t>le</w:t>
+      </w:r>
+      <w:proofErr w:type="gramEnd"/>
+      <w:r>
+        <w:t xml:space="preserve"> dice a los motores de búsqueda en que idioma esta tu sitio web.</w:t>
       </w:r>
     </w:p>
     <w:p>
@@ -2848,10 +4687,34 @@
         </w:numPr>
       </w:pPr>
       <w:r>
-        <w:t>En el Formulario lo correcto semánticamente seria usar etiquetas label en lugar de &lt;p&gt; para los textos de los campos.</w:t>
-      </w:r>
-      <w:r>
-        <w:t xml:space="preserve"> Luego los label e inputs estarían contenidos por la etiqueta &lt;form&gt; faltante.</w:t>
+        <w:t xml:space="preserve">En el Formulario lo correcto semánticamente seria usar etiquetas </w:t>
+      </w:r>
+      <w:proofErr w:type="spellStart"/>
+      <w:r>
+        <w:t>label</w:t>
+      </w:r>
+      <w:proofErr w:type="spellEnd"/>
+      <w:r>
+        <w:t xml:space="preserve"> en lugar de &lt;p&gt; para los textos de los campos.</w:t>
+      </w:r>
+      <w:r>
+        <w:t xml:space="preserve"> Luego los </w:t>
+      </w:r>
+      <w:proofErr w:type="spellStart"/>
+      <w:r>
+        <w:t>label</w:t>
+      </w:r>
+      <w:proofErr w:type="spellEnd"/>
+      <w:r>
+        <w:t xml:space="preserve"> e inputs estarían contenidos por la etiqueta &lt;</w:t>
+      </w:r>
+      <w:proofErr w:type="spellStart"/>
+      <w:r>
+        <w:t>form</w:t>
+      </w:r>
+      <w:proofErr w:type="spellEnd"/>
+      <w:r>
+        <w:t>&gt; faltante.</w:t>
       </w:r>
     </w:p>
     <w:p>
@@ -2871,7 +4734,39 @@
         <w:t>M</w:t>
       </w:r>
       <w:r>
-        <w:t>ejora la accesibilidad de tu formulario asociar la etiqueta &lt;label&gt; con el elemento &lt;input&gt; (a través del atributo for en el label y el id en el input ) :</w:t>
+        <w:t>ejora la accesibilidad de tu formulario asociar la etiqueta &lt;</w:t>
+      </w:r>
+      <w:proofErr w:type="spellStart"/>
+      <w:r>
+        <w:t>label</w:t>
+      </w:r>
+      <w:proofErr w:type="spellEnd"/>
+      <w:r>
+        <w:t xml:space="preserve">&gt; con el elemento &lt;input&gt; (a través del atributo </w:t>
+      </w:r>
+      <w:proofErr w:type="spellStart"/>
+      <w:r>
+        <w:t>for</w:t>
+      </w:r>
+      <w:proofErr w:type="spellEnd"/>
+      <w:r>
+        <w:t xml:space="preserve"> en el </w:t>
+      </w:r>
+      <w:proofErr w:type="spellStart"/>
+      <w:r>
+        <w:t>label</w:t>
+      </w:r>
+      <w:proofErr w:type="spellEnd"/>
+      <w:r>
+        <w:t xml:space="preserve"> y el id en el </w:t>
+      </w:r>
+      <w:proofErr w:type="gramStart"/>
+      <w:r>
+        <w:t>input )</w:t>
+      </w:r>
+      <w:proofErr w:type="gramEnd"/>
+      <w:r>
+        <w:t xml:space="preserve"> :</w:t>
       </w:r>
     </w:p>
     <w:p>
@@ -2885,7 +4780,75 @@
         <w:ind w:left="1416"/>
       </w:pPr>
     </w:p>
-    <w:p/>
+    <w:p>
+      <w:pPr>
+        <w:ind w:left="2124"/>
+      </w:pPr>
+      <w:r>
+        <w:t>&lt;</w:t>
+      </w:r>
+      <w:proofErr w:type="spellStart"/>
+      <w:r>
+        <w:t>label</w:t>
+      </w:r>
+      <w:proofErr w:type="spellEnd"/>
+      <w:r>
+        <w:t xml:space="preserve"> </w:t>
+      </w:r>
+      <w:proofErr w:type="spellStart"/>
+      <w:r>
+        <w:t>for</w:t>
+      </w:r>
+      <w:proofErr w:type="spellEnd"/>
+      <w:r>
+        <w:t>="email"&gt;Email&lt;/</w:t>
+      </w:r>
+      <w:proofErr w:type="spellStart"/>
+      <w:r>
+        <w:t>label</w:t>
+      </w:r>
+      <w:proofErr w:type="spellEnd"/>
+      <w:r>
+        <w:t>&gt;</w:t>
+      </w:r>
+    </w:p>
+    <w:p>
+      <w:pPr>
+        <w:ind w:left="2124"/>
+      </w:pPr>
+      <w:r>
+        <w:t xml:space="preserve">&lt;input </w:t>
+      </w:r>
+      <w:proofErr w:type="spellStart"/>
+      <w:r>
+        <w:t>type</w:t>
+      </w:r>
+      <w:proofErr w:type="spellEnd"/>
+      <w:r>
+        <w:t xml:space="preserve">="email" id="email" </w:t>
+      </w:r>
+      <w:proofErr w:type="spellStart"/>
+      <w:r>
+        <w:t>required</w:t>
+      </w:r>
+      <w:proofErr w:type="spellEnd"/>
+      <w:r>
+        <w:t xml:space="preserve"> </w:t>
+      </w:r>
+      <w:proofErr w:type="spellStart"/>
+      <w:r>
+        <w:t>placeholder</w:t>
+      </w:r>
+      <w:proofErr w:type="spellEnd"/>
+      <w:r>
+        <w:t>="ejemplo@correo.com" &gt;</w:t>
+      </w:r>
+    </w:p>
+    <w:p>
+      <w:pPr>
+        <w:ind w:left="2124"/>
+      </w:pPr>
+    </w:p>
     <w:p/>
     <w:p/>
     <w:p>
@@ -2917,23 +4880,34 @@
           <w:bCs/>
         </w:rPr>
       </w:pPr>
-      <w:r>
-        <w:rPr>
-          <w:rFonts w:ascii="Segoe UI Emoji" w:hAnsi="Segoe UI Emoji" w:cs="Segoe UI Emoji"/>
-          <w:b/>
-          <w:bCs/>
-        </w:rPr>
-        <w:t>Guzman de la Cruz Adriano Arturo</w:t>
-      </w:r>
-    </w:p>
-    <w:p/>
-    <w:p/>
-    <w:p>
-      <w:pPr>
-        <w:rPr>
-          <w:rFonts w:ascii="Segoe UI Emoji" w:hAnsi="Segoe UI Emoji" w:cs="Segoe UI Emoji"/>
-        </w:rPr>
-      </w:pPr>
+      <w:proofErr w:type="spellStart"/>
+      <w:r>
+        <w:rPr>
+          <w:rFonts w:ascii="Segoe UI Emoji" w:hAnsi="Segoe UI Emoji" w:cs="Segoe UI Emoji"/>
+          <w:b/>
+          <w:bCs/>
+        </w:rPr>
+        <w:t>Guzman</w:t>
+      </w:r>
+      <w:proofErr w:type="spellEnd"/>
+      <w:r>
+        <w:rPr>
+          <w:rFonts w:ascii="Segoe UI Emoji" w:hAnsi="Segoe UI Emoji" w:cs="Segoe UI Emoji"/>
+          <w:b/>
+          <w:bCs/>
+        </w:rPr>
+        <w:t xml:space="preserve"> de la Cruz Adriano Arturo</w:t>
+      </w:r>
+    </w:p>
+    <w:p/>
+    <w:p/>
+    <w:p>
+      <w:pPr>
+        <w:rPr>
+          <w:rFonts w:ascii="Segoe UI Emoji" w:hAnsi="Segoe UI Emoji" w:cs="Segoe UI Emoji"/>
+        </w:rPr>
+      </w:pPr>
+      <w:proofErr w:type="gramStart"/>
       <w:r>
         <w:rPr>
           <w:rFonts w:ascii="Segoe UI Emoji" w:hAnsi="Segoe UI Emoji" w:cs="Segoe UI Emoji"/>
@@ -2941,7 +4915,11 @@
         <w:t>🎉</w:t>
       </w:r>
       <w:r>
-        <w:t xml:space="preserve">¡Felicitaciones por la entrega del Desafío 02! </w:t>
+        <w:t>¡</w:t>
+      </w:r>
+      <w:proofErr w:type="gramEnd"/>
+      <w:r>
+        <w:t xml:space="preserve">Felicitaciones por la entrega del Desafío 02! </w:t>
       </w:r>
       <w:r>
         <w:rPr>
@@ -2962,26 +4940,81 @@
     <w:p/>
     <w:p>
       <w:r>
-        <w:t>La estructura HTML esta impecable, destaco la correcta implementación de contenedores semánticos como main, section, footer, etc. El manejo de listas, textos y títulos es correcto</w:t>
-      </w:r>
-    </w:p>
-    <w:p/>
-    <w:p>
-      <w:r>
-        <w:lastRenderedPageBreak/>
-        <w:t>La manipulación de enlaces relativos o absolutos quedo perfecto. Genial que aplicaste pseudoclases para los enlaces.</w:t>
-      </w:r>
-    </w:p>
-    <w:p/>
-    <w:p>
-      <w:r>
-        <w:t>La vinculación de la página de estilos externa es correcta, buenisimo que usaste clases e id’s, quedo genial.</w:t>
-      </w:r>
-    </w:p>
-    <w:p/>
-    <w:p>
-      <w:r>
-        <w:t>Destaco que completaste los atributos alt de las imágenes, esto ayuda a mejorar la accesibilidad de sito web.</w:t>
+        <w:t xml:space="preserve">La estructura HTML esta impecable, destaco la correcta implementación de contenedores semánticos como </w:t>
+      </w:r>
+      <w:proofErr w:type="spellStart"/>
+      <w:r>
+        <w:t>main</w:t>
+      </w:r>
+      <w:proofErr w:type="spellEnd"/>
+      <w:r>
+        <w:t xml:space="preserve">, </w:t>
+      </w:r>
+      <w:proofErr w:type="spellStart"/>
+      <w:r>
+        <w:t>section</w:t>
+      </w:r>
+      <w:proofErr w:type="spellEnd"/>
+      <w:r>
+        <w:t xml:space="preserve">, </w:t>
+      </w:r>
+      <w:proofErr w:type="spellStart"/>
+      <w:r>
+        <w:t>footer</w:t>
+      </w:r>
+      <w:proofErr w:type="spellEnd"/>
+      <w:r>
+        <w:t>, etc. El manejo de listas, textos y títulos es correcto</w:t>
+      </w:r>
+    </w:p>
+    <w:p/>
+    <w:p>
+      <w:r>
+        <w:t xml:space="preserve">La manipulación de enlaces relativos o absolutos quedo perfecto. Genial que aplicaste </w:t>
+      </w:r>
+      <w:proofErr w:type="spellStart"/>
+      <w:r>
+        <w:t>pseudoclases</w:t>
+      </w:r>
+      <w:proofErr w:type="spellEnd"/>
+      <w:r>
+        <w:t xml:space="preserve"> para los enlaces.</w:t>
+      </w:r>
+    </w:p>
+    <w:p/>
+    <w:p>
+      <w:r>
+        <w:t xml:space="preserve">La vinculación de la página de estilos externa es correcta, </w:t>
+      </w:r>
+      <w:proofErr w:type="spellStart"/>
+      <w:r>
+        <w:t>buenisimo</w:t>
+      </w:r>
+      <w:proofErr w:type="spellEnd"/>
+      <w:r>
+        <w:t xml:space="preserve"> que usaste clases e </w:t>
+      </w:r>
+      <w:proofErr w:type="spellStart"/>
+      <w:r>
+        <w:t>id’s</w:t>
+      </w:r>
+      <w:proofErr w:type="spellEnd"/>
+      <w:r>
+        <w:t>, quedo genial.</w:t>
+      </w:r>
+    </w:p>
+    <w:p/>
+    <w:p>
+      <w:r>
+        <w:t xml:space="preserve">Destaco que completaste los atributos </w:t>
+      </w:r>
+      <w:proofErr w:type="spellStart"/>
+      <w:r>
+        <w:t>alt</w:t>
+      </w:r>
+      <w:proofErr w:type="spellEnd"/>
+      <w:r>
+        <w:t xml:space="preserve"> de las imágenes, esto ayuda a mejorar la accesibilidad de sito web.</w:t>
       </w:r>
     </w:p>
     <w:p/>
@@ -2999,8 +5032,37 @@
           <w:numId w:val="1"/>
         </w:numPr>
       </w:pPr>
-      <w:r>
-        <w:t>Recordá cambiar el lenguaje a español &lt;html lang="es"&gt; porque esto le dice a los motores de búsqueda en que idioma esta tu sitio web.</w:t>
+      <w:proofErr w:type="spellStart"/>
+      <w:r>
+        <w:t>Recordá</w:t>
+      </w:r>
+      <w:proofErr w:type="spellEnd"/>
+      <w:r>
+        <w:t xml:space="preserve"> cambiar el lenguaje a español &lt;</w:t>
+      </w:r>
+      <w:proofErr w:type="spellStart"/>
+      <w:r>
+        <w:t>html</w:t>
+      </w:r>
+      <w:proofErr w:type="spellEnd"/>
+      <w:r>
+        <w:t xml:space="preserve"> </w:t>
+      </w:r>
+      <w:proofErr w:type="spellStart"/>
+      <w:r>
+        <w:t>lang</w:t>
+      </w:r>
+      <w:proofErr w:type="spellEnd"/>
+      <w:r>
+        <w:t xml:space="preserve">="es"&gt; porque esto </w:t>
+      </w:r>
+      <w:proofErr w:type="gramStart"/>
+      <w:r>
+        <w:t>le</w:t>
+      </w:r>
+      <w:proofErr w:type="gramEnd"/>
+      <w:r>
+        <w:t xml:space="preserve"> dice a los motores de búsqueda en que idioma esta tu sitio web.</w:t>
       </w:r>
     </w:p>
     <w:p/>
@@ -3030,7 +5092,7 @@
 </file>
 
 <file path=word/numbering.xml><?xml version="1.0" encoding="utf-8"?>
-<w:numbering xmlns:wpc="http://schemas.microsoft.com/office/word/2010/wordprocessingCanvas" xmlns:cx="http://schemas.microsoft.com/office/drawing/2014/chartex" xmlns:cx1="http://schemas.microsoft.com/office/drawing/2015/9/8/chartex" xmlns:cx2="http://schemas.microsoft.com/office/drawing/2015/10/21/chartex" xmlns:cx3="http://schemas.microsoft.com/office/drawing/2016/5/9/chartex" xmlns:cx4="http://schemas.microsoft.com/office/drawing/2016/5/10/chartex" xmlns:cx5="http://schemas.microsoft.com/office/drawing/2016/5/11/chartex" xmlns:cx6="http://schemas.microsoft.com/office/drawing/2016/5/12/chartex" xmlns:cx7="http://schemas.microsoft.com/office/drawing/2016/5/13/chartex" xmlns:cx8="http://schemas.microsoft.com/office/drawing/2016/5/14/chartex" xmlns:mc="http://schemas.openxmlformats.org/markup-compatibility/2006" xmlns:aink="http://schemas.microsoft.com/office/drawing/2016/ink" xmlns:am3d="http://schemas.microsoft.com/office/drawing/2017/model3d" xmlns:o="urn:schemas-microsoft-com:office:office" xmlns:oel="http://schemas.microsoft.com/office/2019/extlst" xmlns:r="http://schemas.openxmlformats.org/officeDocument/2006/relationships" xmlns:m="http://schemas.openxmlformats.org/officeDocument/2006/math" xmlns:v="urn:schemas-microsoft-com:vml" xmlns:wp14="http://schemas.microsoft.com/office/word/2010/wordprocessingDrawing" xmlns:wp="http://schemas.openxmlformats.org/drawingml/2006/wordprocessingDrawing" xmlns:w10="urn:schemas-microsoft-com:office:word" xmlns:w="http://schemas.openxmlformats.org/wordprocessingml/2006/main" xmlns:w14="http://schemas.microsoft.com/office/word/2010/wordml" xmlns:w15="http://schemas.microsoft.com/office/word/2012/wordml" xmlns:w16cex="http://schemas.microsoft.com/office/word/2018/wordml/cex" xmlns:w16cid="http://schemas.microsoft.com/office/word/2016/wordml/cid" xmlns:w16="http://schemas.microsoft.com/office/word/2018/wordml" xmlns:w16du="http://schemas.microsoft.com/office/word/2023/wordml/word16du" xmlns:w16sdtdh="http://schemas.microsoft.com/office/word/2020/wordml/sdtdatahash" xmlns:w16sdtfl="http://schemas.microsoft.com/office/word/2024/wordml/sdtformatlock" xmlns:w16se="http://schemas.microsoft.com/office/word/2015/wordml/symex" xmlns:wpg="http://schemas.microsoft.com/office/word/2010/wordprocessingGroup" xmlns:wpi="http://schemas.microsoft.com/office/word/2010/wordprocessingInk" xmlns:wne="http://schemas.microsoft.com/office/word/2006/wordml" xmlns:wps="http://schemas.microsoft.com/office/word/2010/wordprocessingShape" mc:Ignorable="w14 w15 w16se w16cid w16 w16cex w16sdtdh w16sdtfl w16du wp14">
+<w:numbering xmlns:wpc="http://schemas.microsoft.com/office/word/2010/wordprocessingCanvas" xmlns:cx="http://schemas.microsoft.com/office/drawing/2014/chartex" xmlns:cx1="http://schemas.microsoft.com/office/drawing/2015/9/8/chartex" xmlns:cx2="http://schemas.microsoft.com/office/drawing/2015/10/21/chartex" xmlns:cx3="http://schemas.microsoft.com/office/drawing/2016/5/9/chartex" xmlns:cx4="http://schemas.microsoft.com/office/drawing/2016/5/10/chartex" xmlns:cx5="http://schemas.microsoft.com/office/drawing/2016/5/11/chartex" xmlns:cx6="http://schemas.microsoft.com/office/drawing/2016/5/12/chartex" xmlns:cx7="http://schemas.microsoft.com/office/drawing/2016/5/13/chartex" xmlns:cx8="http://schemas.microsoft.com/office/drawing/2016/5/14/chartex" xmlns:mc="http://schemas.openxmlformats.org/markup-compatibility/2006" xmlns:aink="http://schemas.microsoft.com/office/drawing/2016/ink" xmlns:am3d="http://schemas.microsoft.com/office/drawing/2017/model3d" xmlns:o="urn:schemas-microsoft-com:office:office" xmlns:oel="http://schemas.microsoft.com/office/2019/extlst" xmlns:r="http://schemas.openxmlformats.org/officeDocument/2006/relationships" xmlns:m="http://schemas.openxmlformats.org/officeDocument/2006/math" xmlns:v="urn:schemas-microsoft-com:vml" xmlns:wp14="http://schemas.microsoft.com/office/word/2010/wordprocessingDrawing" xmlns:wp="http://schemas.openxmlformats.org/drawingml/2006/wordprocessingDrawing" xmlns:w10="urn:schemas-microsoft-com:office:word" xmlns:w="http://schemas.openxmlformats.org/wordprocessingml/2006/main" xmlns:w14="http://schemas.microsoft.com/office/word/2010/wordml" xmlns:w15="http://schemas.microsoft.com/office/word/2012/wordml" xmlns:w16cex="http://schemas.microsoft.com/office/word/2018/wordml/cex" xmlns:w16cid="http://schemas.microsoft.com/office/word/2016/wordml/cid" xmlns:w16="http://schemas.microsoft.com/office/word/2018/wordml" xmlns:w16sdtdh="http://schemas.microsoft.com/office/word/2020/wordml/sdtdatahash" xmlns:w16se="http://schemas.microsoft.com/office/word/2015/wordml/symex" xmlns:wpg="http://schemas.microsoft.com/office/word/2010/wordprocessingGroup" xmlns:wpi="http://schemas.microsoft.com/office/word/2010/wordprocessingInk" xmlns:wne="http://schemas.microsoft.com/office/word/2006/wordml" xmlns:wps="http://schemas.microsoft.com/office/word/2010/wordprocessingShape" mc:Ignorable="w14 w15 w16se w16cid w16 w16cex w16sdtdh wp14">
   <w:abstractNum w:abstractNumId="0" w15:restartNumberingAfterBreak="0">
     <w:nsid w:val="14BF2A4A"/>
     <w:multiLevelType w:val="hybridMultilevel"/>
@@ -3383,7 +5445,7 @@
 </file>
 
 <file path=word/styles.xml><?xml version="1.0" encoding="utf-8"?>
-<w:styles xmlns:mc="http://schemas.openxmlformats.org/markup-compatibility/2006" xmlns:r="http://schemas.openxmlformats.org/officeDocument/2006/relationships" xmlns:w="http://schemas.openxmlformats.org/wordprocessingml/2006/main" xmlns:w14="http://schemas.microsoft.com/office/word/2010/wordml" xmlns:w15="http://schemas.microsoft.com/office/word/2012/wordml" xmlns:w16cex="http://schemas.microsoft.com/office/word/2018/wordml/cex" xmlns:w16cid="http://schemas.microsoft.com/office/word/2016/wordml/cid" xmlns:w16="http://schemas.microsoft.com/office/word/2018/wordml" xmlns:w16du="http://schemas.microsoft.com/office/word/2023/wordml/word16du" xmlns:w16sdtdh="http://schemas.microsoft.com/office/word/2020/wordml/sdtdatahash" xmlns:w16sdtfl="http://schemas.microsoft.com/office/word/2024/wordml/sdtformatlock" xmlns:w16se="http://schemas.microsoft.com/office/word/2015/wordml/symex" mc:Ignorable="w14 w15 w16se w16cid w16 w16cex w16sdtdh w16sdtfl w16du">
+<w:styles xmlns:mc="http://schemas.openxmlformats.org/markup-compatibility/2006" xmlns:r="http://schemas.openxmlformats.org/officeDocument/2006/relationships" xmlns:w="http://schemas.openxmlformats.org/wordprocessingml/2006/main" xmlns:w14="http://schemas.microsoft.com/office/word/2010/wordml" xmlns:w15="http://schemas.microsoft.com/office/word/2012/wordml" xmlns:w16cex="http://schemas.microsoft.com/office/word/2018/wordml/cex" xmlns:w16cid="http://schemas.microsoft.com/office/word/2016/wordml/cid" xmlns:w16="http://schemas.microsoft.com/office/word/2018/wordml" xmlns:w16sdtdh="http://schemas.microsoft.com/office/word/2020/wordml/sdtdatahash" xmlns:w16se="http://schemas.microsoft.com/office/word/2015/wordml/symex" mc:Ignorable="w14 w15 w16se w16cid w16 w16cex w16sdtdh">
   <w:docDefaults>
     <w:rPrDefault>
       <w:rPr>
@@ -3789,6 +5851,7 @@
   <w:style w:type="character" w:default="1" w:styleId="Fuentedeprrafopredeter">
     <w:name w:val="Default Paragraph Font"/>
     <w:uiPriority w:val="1"/>
+    <w:semiHidden/>
     <w:unhideWhenUsed/>
   </w:style>
   <w:style w:type="table" w:default="1" w:styleId="Tablanormal">

</xml_diff>